<commit_message>
Format research paper in IEEE style
</commit_message>
<xml_diff>
--- a/APL_Logistics_Research_Paper.docx
+++ b/APL_Logistics_Research_Paper.docx
@@ -4,275 +4,205 @@
   <w:body>
     <w:p>
       <w:pPr>
-        <w:spacing w:after="1560"/>
-      </w:pPr>
-    </w:p>
-    <w:p>
-      <w:pPr>
-        <w:spacing w:after="360"/>
+        <w:spacing w:after="120"/>
         <w:jc w:val="center"/>
       </w:pPr>
       <w:r>
         <w:rPr>
-          <w:rFonts w:ascii="Calibri" w:hAnsi="Calibri"/>
-          <w:b/>
+          <w:rFonts w:ascii="Times New Roman" w:hAnsi="Times New Roman"/>
+          <w:b w:val="0"/>
           <w:i w:val="0"/>
-          <w:color w:val="1F4D78"/>
-          <w:sz w:val="22"/>
-        </w:rPr>
-        <w:t>RESEARCH PAPER</w:t>
-      </w:r>
-    </w:p>
-    <w:p>
-      <w:pPr>
-        <w:spacing w:after="200"/>
-        <w:jc w:val="center"/>
-      </w:pPr>
-      <w:r>
-        <w:rPr>
-          <w:rFonts w:ascii="Calibri" w:hAnsi="Calibri"/>
-          <w:b/>
-          <w:i w:val="0"/>
-          <w:color w:val="0B2545"/>
-          <w:sz w:val="56"/>
+          <w:sz w:val="48"/>
         </w:rPr>
         <w:t>APL Logistics Profitability Intelligence</w:t>
       </w:r>
     </w:p>
     <w:p>
       <w:pPr>
-        <w:spacing w:after="1440"/>
+        <w:spacing w:after="160"/>
         <w:jc w:val="center"/>
       </w:pPr>
       <w:r>
         <w:rPr>
-          <w:rFonts w:ascii="Calibri" w:hAnsi="Calibri"/>
+          <w:rFonts w:ascii="Times New Roman" w:hAnsi="Times New Roman"/>
           <w:b w:val="0"/>
           <w:i w:val="0"/>
-          <w:color w:val="595959"/>
-          <w:sz w:val="28"/>
+          <w:sz w:val="22"/>
         </w:rPr>
-        <w:t>Exploratory Data Analysis, Operational Insights, and Recommendations</w:t>
+        <w:t>[Student Name]</w:t>
+        <w:br/>
+        <w:t>Supply Chain Analytics Project</w:t>
       </w:r>
     </w:p>
     <w:p>
       <w:pPr>
-        <w:spacing w:after="100"/>
+        <w:sectPr>
+          <w:pgSz w:w="12240" w:h="15840"/>
+          <w:pgMar w:top="936" w:right="1080" w:bottom="936" w:left="1080" w:header="720" w:footer="720" w:gutter="0"/>
+          <w:cols w:space="720"/>
+          <w:docGrid w:linePitch="360"/>
+        </w:sectPr>
+      </w:pPr>
+    </w:p>
+    <w:p>
+      <w:pPr>
+        <w:spacing w:after="80" w:line="240" w:lineRule="auto"/>
+      </w:pPr>
+      <w:r>
+        <w:rPr>
+          <w:rFonts w:ascii="Times New Roman" w:hAnsi="Times New Roman"/>
+          <w:b/>
+          <w:i w:val="0"/>
+          <w:sz w:val="18"/>
+        </w:rPr>
+        <w:t>Abstract—</w:t>
+      </w:r>
+      <w:r>
+        <w:rPr>
+          <w:rFonts w:ascii="Times New Roman" w:hAnsi="Times New Roman"/>
+          <w:b w:val="0"/>
+          <w:i w:val="0"/>
+          <w:sz w:val="18"/>
+        </w:rPr>
+        <w:t>This study analyses 180,519 APL Logistics order-line records to identify the commercial factors associated with revenue, profitability, customer value, product performance, and discounting. The dataset covers five markets, 50 product categories, and 20,652 customers. Recorded sales total $36.78M and profit totals $3.97M, producing a 10.8% overall profit margin. A Streamlit dashboard built with Python, Pandas, and Plotly presents market, customer, category, product, and discount insights. The results show strong profit concentration in Europe and LATAM, variation in customer-segment contribution, and lower margins at higher discount levels. The paper recommends discount guardrails, customer-value tiers, and routine profitability monitoring.</w:t>
+      </w:r>
+    </w:p>
+    <w:p>
+      <w:pPr>
+        <w:spacing w:after="120"/>
+      </w:pPr>
+      <w:r>
+        <w:rPr>
+          <w:rFonts w:ascii="Times New Roman" w:hAnsi="Times New Roman"/>
+          <w:b/>
+          <w:i w:val="0"/>
+          <w:sz w:val="18"/>
+        </w:rPr>
+        <w:t>Index Terms—</w:t>
+      </w:r>
+      <w:r>
+        <w:rPr>
+          <w:rFonts w:ascii="Times New Roman" w:hAnsi="Times New Roman"/>
+          <w:b w:val="0"/>
+          <w:i/>
+          <w:sz w:val="18"/>
+        </w:rPr>
+        <w:t>supply chain analytics, profitability, customer value, discount analysis, exploratory data analysis, Streamlit.</w:t>
+      </w:r>
+    </w:p>
+    <w:p>
+      <w:pPr>
+        <w:keepNext/>
+        <w:spacing w:before="160" w:after="80"/>
         <w:jc w:val="center"/>
       </w:pPr>
       <w:r>
         <w:rPr>
-          <w:rFonts w:ascii="Calibri" w:hAnsi="Calibri"/>
-          <w:b w:val="0"/>
+          <w:rFonts w:ascii="Times New Roman" w:hAnsi="Times New Roman"/>
+          <w:b/>
           <w:i w:val="0"/>
-          <w:color w:val="595959"/>
-          <w:sz w:val="22"/>
+          <w:sz w:val="20"/>
         </w:rPr>
-        <w:t>Prepared by: [Student Name]</w:t>
+        <w:t>I. INTRODUCTION</w:t>
       </w:r>
     </w:p>
     <w:p>
       <w:pPr>
-        <w:spacing w:after="100"/>
+        <w:spacing w:before="0" w:after="80" w:line="240" w:lineRule="auto"/>
+        <w:jc w:val="both"/>
+      </w:pPr>
+      <w:r>
+        <w:rPr>
+          <w:rFonts w:ascii="Times New Roman" w:hAnsi="Times New Roman"/>
+          <w:b w:val="0"/>
+          <w:i w:val="0"/>
+          <w:sz w:val="20"/>
+        </w:rPr>
+        <w:t>Supply-chain decisions benefit from connecting commercial activity with financial outcomes. The APL Logistics dashboard brings sales, profit, customers, products, discounts, categories, and markets into one view. It supports descriptive exploratory data analysis (EDA) rather than causal inference, and addresses three questions: which entities create value, how discounting relates to margin, and where management attention should be directed.</w:t>
+      </w:r>
+    </w:p>
+    <w:p>
+      <w:pPr>
+        <w:keepNext/>
+        <w:spacing w:before="160" w:after="80"/>
         <w:jc w:val="center"/>
       </w:pPr>
       <w:r>
         <w:rPr>
-          <w:rFonts w:ascii="Calibri" w:hAnsi="Calibri"/>
-          <w:b w:val="0"/>
+          <w:rFonts w:ascii="Times New Roman" w:hAnsi="Times New Roman"/>
+          <w:b/>
           <w:i w:val="0"/>
-          <w:color w:val="595959"/>
-          <w:sz w:val="22"/>
+          <w:sz w:val="20"/>
         </w:rPr>
-        <w:t>Project: Supply Chain Analytics Dashboard</w:t>
+        <w:t>II. DATA AND METHODOLOGY</w:t>
       </w:r>
     </w:p>
     <w:p>
       <w:pPr>
-        <w:spacing w:after="100"/>
-        <w:jc w:val="center"/>
-      </w:pPr>
-      <w:r>
-        <w:rPr>
-          <w:rFonts w:ascii="Calibri" w:hAnsi="Calibri"/>
-          <w:b w:val="0"/>
-          <w:i w:val="0"/>
-          <w:color w:val="595959"/>
-          <w:sz w:val="22"/>
-        </w:rPr>
-        <w:t>Date: August 2026</w:t>
-      </w:r>
-    </w:p>
-    <w:p>
-      <w:r>
-        <w:br w:type="page"/>
-      </w:r>
-    </w:p>
-    <w:p>
-      <w:pPr>
-        <w:spacing w:before="360" w:after="200"/>
-      </w:pPr>
-      <w:r>
-        <w:rPr>
-          <w:rFonts w:ascii="Calibri" w:hAnsi="Calibri"/>
-          <w:b/>
-          <w:i w:val="0"/>
-          <w:color w:val="2E74B5"/>
-          <w:sz w:val="32"/>
-        </w:rPr>
-        <w:t>Abstract</w:t>
-      </w:r>
-    </w:p>
-    <w:p>
-      <w:pPr>
-        <w:spacing w:after="160" w:line="319" w:lineRule="auto"/>
+        <w:spacing w:before="0" w:after="80" w:line="240" w:lineRule="auto"/>
         <w:jc w:val="both"/>
       </w:pPr>
       <w:r>
         <w:rPr>
-          <w:rFonts w:ascii="Calibri" w:hAnsi="Calibri"/>
+          <w:rFonts w:ascii="Times New Roman" w:hAnsi="Times New Roman"/>
           <w:b w:val="0"/>
           <w:i w:val="0"/>
-          <w:color w:val="000000"/>
-          <w:sz w:val="22"/>
+          <w:sz w:val="20"/>
         </w:rPr>
-        <w:t>This applied analytics study examines 180,519 APL Logistics order-line records to identify the commercial factors associated with revenue, profitability, customer value, product performance, and discounting. The dataset contains 41 fields spanning 5 markets, 50 product categories, and 20,652 customers. Total recorded sales were $36.78M and total profit was $3.97M, producing an overall profit margin of 10.8%. The analysis was implemented as a Streamlit dashboard using Python, Pandas, and Plotly so that decision makers can interrogate the same indicators interactively. Results show strong market concentration in Europe and LATAM, variation in profit contribution across customer segments, and declining margin as discount intensity increases. The paper translates these findings into practical recommendations for pricing governance, customer strategy, and performance monitoring.</w:t>
-      </w:r>
-    </w:p>
-    <w:p>
-      <w:pPr>
-        <w:spacing w:before="360" w:after="200"/>
-      </w:pPr>
-      <w:r>
-        <w:rPr>
-          <w:rFonts w:ascii="Calibri" w:hAnsi="Calibri"/>
-          <w:b/>
-          <w:i w:val="0"/>
-          <w:color w:val="2E74B5"/>
-          <w:sz w:val="32"/>
-        </w:rPr>
-        <w:t>1. Introduction</w:t>
-      </w:r>
-    </w:p>
-    <w:p>
-      <w:pPr>
-        <w:spacing w:after="160" w:line="319" w:lineRule="auto"/>
-        <w:jc w:val="both"/>
-      </w:pPr>
-      <w:r>
-        <w:rPr>
-          <w:rFonts w:ascii="Calibri" w:hAnsi="Calibri"/>
-          <w:b w:val="0"/>
-          <w:i w:val="0"/>
-          <w:color w:val="000000"/>
-          <w:sz w:val="22"/>
-        </w:rPr>
-        <w:t>Supply-chain decision making depends on connecting commercial activity with financial outcomes. A dashboard can make these relationships visible by bringing sales, profit, customer, product, discount, and market indicators into a single analytical view. This project develops an interactive profitability-intelligence dashboard for APL Logistics and uses exploratory data analysis (EDA) to frame actionable management questions.</w:t>
-      </w:r>
-    </w:p>
-    <w:p>
-      <w:pPr>
-        <w:spacing w:after="160" w:line="319" w:lineRule="auto"/>
-        <w:jc w:val="both"/>
-      </w:pPr>
-      <w:r>
-        <w:rPr>
-          <w:rFonts w:ascii="Calibri" w:hAnsi="Calibri"/>
-          <w:b w:val="0"/>
-          <w:i w:val="0"/>
-          <w:color w:val="000000"/>
-          <w:sz w:val="22"/>
-        </w:rPr>
-        <w:t>The purpose of the study is not to establish causality. Instead, it provides a descriptive baseline that helps stakeholders prioritize investigation and commercial improvement. The core questions are: Which customers, markets, products, and categories generate the most value? How are discounts associated with margin? What actions should managers take to improve profitability while protecting customer value?</w:t>
-      </w:r>
-    </w:p>
-    <w:p>
-      <w:pPr>
-        <w:spacing w:before="360" w:after="200"/>
-      </w:pPr>
-      <w:r>
-        <w:rPr>
-          <w:rFonts w:ascii="Calibri" w:hAnsi="Calibri"/>
-          <w:b/>
-          <w:i w:val="0"/>
-          <w:color w:val="2E74B5"/>
-          <w:sz w:val="32"/>
-        </w:rPr>
-        <w:t>2. Data and Methodology</w:t>
-      </w:r>
-    </w:p>
-    <w:p>
-      <w:pPr>
-        <w:spacing w:after="160" w:line="319" w:lineRule="auto"/>
-        <w:jc w:val="both"/>
-      </w:pPr>
-      <w:r>
-        <w:rPr>
-          <w:rFonts w:ascii="Calibri" w:hAnsi="Calibri"/>
-          <w:b w:val="0"/>
-          <w:i w:val="0"/>
-          <w:color w:val="000000"/>
-          <w:sz w:val="22"/>
-        </w:rPr>
-        <w:t>The analysis uses the supplied APL_Logistics.csv file. Each record is treated as an order-line item. The file was read using Latin-1 encoding, numeric fields were standardized, and derived measures were calculated for discount percentage, profit margin, and customer name. Records were aggregated by market, category, customer segment, product, and discount band.</w:t>
+        <w:t>The analysis uses the supplied APL_Logistics.csv data set [1]. Each record is treated as an order-line item. The source file was read with Latin-1 encoding, relevant numerical fields were standardized, and customer name, discount percentage, discount band, and profit margin were derived. Results were aggregated by market, customer segment, category, product, and discount band. The dashboard reports total revenue, total profit, profit margin, average discount, top and bottom customers, category-market profitability, and discount scenarios. No time-series analysis is presented because the supplied file has no order-date field.</w:t>
       </w:r>
     </w:p>
     <w:tbl>
       <w:tblPr>
         <w:tblStyle w:val="TableGrid"/>
-        <w:tblW w:type="dxa" w:w="9360"/>
+        <w:tblW w:type="auto" w:w="0"/>
         <w:tblLayout w:type="fixed"/>
         <w:tblLook w:firstColumn="1" w:firstRow="1" w:lastColumn="0" w:lastRow="0" w:noHBand="0" w:noVBand="1" w:val="04A0"/>
-        <w:tblInd w:w="120" w:type="dxa"/>
       </w:tblPr>
       <w:tblGrid>
-        <w:gridCol w:w="4500"/>
-        <w:gridCol w:w="4860"/>
+        <w:gridCol w:w="5040"/>
+        <w:gridCol w:w="5040"/>
       </w:tblGrid>
       <w:tr>
         <w:tc>
           <w:tcPr>
-            <w:tcW w:type="dxa" w:w="4500"/>
-            <w:shd w:fill="F2F4F7"/>
-            <w:tcMar>
-              <w:top w:w="80" w:type="dxa"/>
-              <w:start w:w="120" w:type="dxa"/>
-              <w:bottom w:w="80" w:type="dxa"/>
-              <w:end w:w="120" w:type="dxa"/>
-            </w:tcMar>
+            <w:tcW w:type="dxa" w:w="5040"/>
+            <w:vAlign w:val="center"/>
+            <w:shd w:fill="D9E2F3"/>
           </w:tcPr>
           <w:p>
+            <w:pPr>
+              <w:spacing w:after="20"/>
+              <w:jc w:val="center"/>
+            </w:pPr>
             <w:r>
               <w:rPr>
-                <w:rFonts w:ascii="Calibri" w:hAnsi="Calibri"/>
+                <w:rFonts w:ascii="Times New Roman" w:hAnsi="Times New Roman"/>
                 <w:b/>
                 <w:i w:val="0"/>
-                <w:color w:val="1F4D78"/>
-                <w:sz w:val="22"/>
+                <w:sz w:val="16"/>
               </w:rPr>
-              <w:t>Metric</w:t>
+              <w:t>Measure</w:t>
             </w:r>
           </w:p>
         </w:tc>
         <w:tc>
           <w:tcPr>
-            <w:tcW w:type="dxa" w:w="4860"/>
-            <w:shd w:fill="F2F4F7"/>
-            <w:tcMar>
-              <w:top w:w="80" w:type="dxa"/>
-              <w:start w:w="120" w:type="dxa"/>
-              <w:bottom w:w="80" w:type="dxa"/>
-              <w:end w:w="120" w:type="dxa"/>
-            </w:tcMar>
+            <w:tcW w:type="dxa" w:w="5040"/>
+            <w:vAlign w:val="center"/>
+            <w:shd w:fill="D9E2F3"/>
           </w:tcPr>
           <w:p>
+            <w:pPr>
+              <w:spacing w:after="20"/>
+              <w:jc w:val="center"/>
+            </w:pPr>
             <w:r>
               <w:rPr>
-                <w:rFonts w:ascii="Calibri" w:hAnsi="Calibri"/>
+                <w:rFonts w:ascii="Times New Roman" w:hAnsi="Times New Roman"/>
                 <w:b/>
                 <w:i w:val="0"/>
-                <w:color w:val="1F4D78"/>
-                <w:sz w:val="22"/>
+                <w:sz w:val="16"/>
               </w:rPr>
               <w:t>Value</w:t>
             </w:r>
@@ -282,45 +212,41 @@
       <w:tr>
         <w:tc>
           <w:tcPr>
-            <w:tcW w:type="dxa" w:w="4500"/>
-            <w:tcMar>
-              <w:top w:w="80" w:type="dxa"/>
-              <w:start w:w="120" w:type="dxa"/>
-              <w:bottom w:w="80" w:type="dxa"/>
-              <w:end w:w="120" w:type="dxa"/>
-            </w:tcMar>
+            <w:tcW w:type="dxa" w:w="5040"/>
+            <w:vAlign w:val="center"/>
           </w:tcPr>
           <w:p>
+            <w:pPr>
+              <w:spacing w:after="20"/>
+              <w:jc w:val="center"/>
+            </w:pPr>
             <w:r>
               <w:rPr>
-                <w:rFonts w:ascii="Calibri" w:hAnsi="Calibri"/>
+                <w:rFonts w:ascii="Times New Roman" w:hAnsi="Times New Roman"/>
                 <w:b w:val="0"/>
                 <w:i w:val="0"/>
-                <w:color w:val="000000"/>
-                <w:sz w:val="22"/>
+                <w:sz w:val="16"/>
               </w:rPr>
-              <w:t>Records analysed</w:t>
+              <w:t>Order-line records</w:t>
             </w:r>
           </w:p>
         </w:tc>
         <w:tc>
           <w:tcPr>
-            <w:tcW w:type="dxa" w:w="4860"/>
-            <w:tcMar>
-              <w:top w:w="80" w:type="dxa"/>
-              <w:start w:w="120" w:type="dxa"/>
-              <w:bottom w:w="80" w:type="dxa"/>
-              <w:end w:w="120" w:type="dxa"/>
-            </w:tcMar>
+            <w:tcW w:type="dxa" w:w="5040"/>
+            <w:vAlign w:val="center"/>
           </w:tcPr>
           <w:p>
+            <w:pPr>
+              <w:spacing w:after="20"/>
+              <w:jc w:val="center"/>
+            </w:pPr>
             <w:r>
               <w:rPr>
-                <w:rFonts w:ascii="Calibri" w:hAnsi="Calibri"/>
+                <w:rFonts w:ascii="Times New Roman" w:hAnsi="Times New Roman"/>
                 <w:b w:val="0"/>
                 <w:i w:val="0"/>
-                <w:color w:val="000000"/>
-                <w:sz w:val="22"/>
+                <w:sz w:val="16"/>
               </w:rPr>
               <w:t>180,519</w:t>
             </w:r>
@@ -330,22 +256,20 @@
       <w:tr>
         <w:tc>
           <w:tcPr>
-            <w:tcW w:type="dxa" w:w="4500"/>
-            <w:tcMar>
-              <w:top w:w="80" w:type="dxa"/>
-              <w:start w:w="120" w:type="dxa"/>
-              <w:bottom w:w="80" w:type="dxa"/>
-              <w:end w:w="120" w:type="dxa"/>
-            </w:tcMar>
+            <w:tcW w:type="dxa" w:w="5040"/>
+            <w:vAlign w:val="center"/>
           </w:tcPr>
           <w:p>
+            <w:pPr>
+              <w:spacing w:after="20"/>
+              <w:jc w:val="center"/>
+            </w:pPr>
             <w:r>
               <w:rPr>
-                <w:rFonts w:ascii="Calibri" w:hAnsi="Calibri"/>
+                <w:rFonts w:ascii="Times New Roman" w:hAnsi="Times New Roman"/>
                 <w:b w:val="0"/>
                 <w:i w:val="0"/>
-                <w:color w:val="000000"/>
-                <w:sz w:val="22"/>
+                <w:sz w:val="16"/>
               </w:rPr>
               <w:t>Variables</w:t>
             </w:r>
@@ -353,22 +277,20 @@
         </w:tc>
         <w:tc>
           <w:tcPr>
-            <w:tcW w:type="dxa" w:w="4860"/>
-            <w:tcMar>
-              <w:top w:w="80" w:type="dxa"/>
-              <w:start w:w="120" w:type="dxa"/>
-              <w:bottom w:w="80" w:type="dxa"/>
-              <w:end w:w="120" w:type="dxa"/>
-            </w:tcMar>
+            <w:tcW w:type="dxa" w:w="5040"/>
+            <w:vAlign w:val="center"/>
           </w:tcPr>
           <w:p>
+            <w:pPr>
+              <w:spacing w:after="20"/>
+              <w:jc w:val="center"/>
+            </w:pPr>
             <w:r>
               <w:rPr>
-                <w:rFonts w:ascii="Calibri" w:hAnsi="Calibri"/>
+                <w:rFonts w:ascii="Times New Roman" w:hAnsi="Times New Roman"/>
                 <w:b w:val="0"/>
                 <w:i w:val="0"/>
-                <w:color w:val="000000"/>
-                <w:sz w:val="22"/>
+                <w:sz w:val="16"/>
               </w:rPr>
               <w:t>41</w:t>
             </w:r>
@@ -378,22 +300,20 @@
       <w:tr>
         <w:tc>
           <w:tcPr>
-            <w:tcW w:type="dxa" w:w="4500"/>
-            <w:tcMar>
-              <w:top w:w="80" w:type="dxa"/>
-              <w:start w:w="120" w:type="dxa"/>
-              <w:bottom w:w="80" w:type="dxa"/>
-              <w:end w:w="120" w:type="dxa"/>
-            </w:tcMar>
+            <w:tcW w:type="dxa" w:w="5040"/>
+            <w:vAlign w:val="center"/>
           </w:tcPr>
           <w:p>
+            <w:pPr>
+              <w:spacing w:after="20"/>
+              <w:jc w:val="center"/>
+            </w:pPr>
             <w:r>
               <w:rPr>
-                <w:rFonts w:ascii="Calibri" w:hAnsi="Calibri"/>
+                <w:rFonts w:ascii="Times New Roman" w:hAnsi="Times New Roman"/>
                 <w:b w:val="0"/>
                 <w:i w:val="0"/>
-                <w:color w:val="000000"/>
-                <w:sz w:val="22"/>
+                <w:sz w:val="16"/>
               </w:rPr>
               <w:t>Customers</w:t>
             </w:r>
@@ -401,22 +321,20 @@
         </w:tc>
         <w:tc>
           <w:tcPr>
-            <w:tcW w:type="dxa" w:w="4860"/>
-            <w:tcMar>
-              <w:top w:w="80" w:type="dxa"/>
-              <w:start w:w="120" w:type="dxa"/>
-              <w:bottom w:w="80" w:type="dxa"/>
-              <w:end w:w="120" w:type="dxa"/>
-            </w:tcMar>
+            <w:tcW w:type="dxa" w:w="5040"/>
+            <w:vAlign w:val="center"/>
           </w:tcPr>
           <w:p>
+            <w:pPr>
+              <w:spacing w:after="20"/>
+              <w:jc w:val="center"/>
+            </w:pPr>
             <w:r>
               <w:rPr>
-                <w:rFonts w:ascii="Calibri" w:hAnsi="Calibri"/>
+                <w:rFonts w:ascii="Times New Roman" w:hAnsi="Times New Roman"/>
                 <w:b w:val="0"/>
                 <w:i w:val="0"/>
-                <w:color w:val="000000"/>
-                <w:sz w:val="22"/>
+                <w:sz w:val="16"/>
               </w:rPr>
               <w:t>20,652</w:t>
             </w:r>
@@ -426,22 +344,20 @@
       <w:tr>
         <w:tc>
           <w:tcPr>
-            <w:tcW w:type="dxa" w:w="4500"/>
-            <w:tcMar>
-              <w:top w:w="80" w:type="dxa"/>
-              <w:start w:w="120" w:type="dxa"/>
-              <w:bottom w:w="80" w:type="dxa"/>
-              <w:end w:w="120" w:type="dxa"/>
-            </w:tcMar>
+            <w:tcW w:type="dxa" w:w="5040"/>
+            <w:vAlign w:val="center"/>
           </w:tcPr>
           <w:p>
+            <w:pPr>
+              <w:spacing w:after="20"/>
+              <w:jc w:val="center"/>
+            </w:pPr>
             <w:r>
               <w:rPr>
-                <w:rFonts w:ascii="Calibri" w:hAnsi="Calibri"/>
+                <w:rFonts w:ascii="Times New Roman" w:hAnsi="Times New Roman"/>
                 <w:b w:val="0"/>
                 <w:i w:val="0"/>
-                <w:color w:val="000000"/>
-                <w:sz w:val="22"/>
+                <w:sz w:val="16"/>
               </w:rPr>
               <w:t>Markets</w:t>
             </w:r>
@@ -449,22 +365,20 @@
         </w:tc>
         <w:tc>
           <w:tcPr>
-            <w:tcW w:type="dxa" w:w="4860"/>
-            <w:tcMar>
-              <w:top w:w="80" w:type="dxa"/>
-              <w:start w:w="120" w:type="dxa"/>
-              <w:bottom w:w="80" w:type="dxa"/>
-              <w:end w:w="120" w:type="dxa"/>
-            </w:tcMar>
+            <w:tcW w:type="dxa" w:w="5040"/>
+            <w:vAlign w:val="center"/>
           </w:tcPr>
           <w:p>
+            <w:pPr>
+              <w:spacing w:after="20"/>
+              <w:jc w:val="center"/>
+            </w:pPr>
             <w:r>
               <w:rPr>
-                <w:rFonts w:ascii="Calibri" w:hAnsi="Calibri"/>
+                <w:rFonts w:ascii="Times New Roman" w:hAnsi="Times New Roman"/>
                 <w:b w:val="0"/>
                 <w:i w:val="0"/>
-                <w:color w:val="000000"/>
-                <w:sz w:val="22"/>
+                <w:sz w:val="16"/>
               </w:rPr>
               <w:t>5</w:t>
             </w:r>
@@ -474,22 +388,20 @@
       <w:tr>
         <w:tc>
           <w:tcPr>
-            <w:tcW w:type="dxa" w:w="4500"/>
-            <w:tcMar>
-              <w:top w:w="80" w:type="dxa"/>
-              <w:start w:w="120" w:type="dxa"/>
-              <w:bottom w:w="80" w:type="dxa"/>
-              <w:end w:w="120" w:type="dxa"/>
-            </w:tcMar>
+            <w:tcW w:type="dxa" w:w="5040"/>
+            <w:vAlign w:val="center"/>
           </w:tcPr>
           <w:p>
+            <w:pPr>
+              <w:spacing w:after="20"/>
+              <w:jc w:val="center"/>
+            </w:pPr>
             <w:r>
               <w:rPr>
-                <w:rFonts w:ascii="Calibri" w:hAnsi="Calibri"/>
+                <w:rFonts w:ascii="Times New Roman" w:hAnsi="Times New Roman"/>
                 <w:b w:val="0"/>
                 <w:i w:val="0"/>
-                <w:color w:val="000000"/>
-                <w:sz w:val="22"/>
+                <w:sz w:val="16"/>
               </w:rPr>
               <w:t>Product categories</w:t>
             </w:r>
@@ -497,22 +409,20 @@
         </w:tc>
         <w:tc>
           <w:tcPr>
-            <w:tcW w:type="dxa" w:w="4860"/>
-            <w:tcMar>
-              <w:top w:w="80" w:type="dxa"/>
-              <w:start w:w="120" w:type="dxa"/>
-              <w:bottom w:w="80" w:type="dxa"/>
-              <w:end w:w="120" w:type="dxa"/>
-            </w:tcMar>
+            <w:tcW w:type="dxa" w:w="5040"/>
+            <w:vAlign w:val="center"/>
           </w:tcPr>
           <w:p>
+            <w:pPr>
+              <w:spacing w:after="20"/>
+              <w:jc w:val="center"/>
+            </w:pPr>
             <w:r>
               <w:rPr>
-                <w:rFonts w:ascii="Calibri" w:hAnsi="Calibri"/>
+                <w:rFonts w:ascii="Times New Roman" w:hAnsi="Times New Roman"/>
                 <w:b w:val="0"/>
                 <w:i w:val="0"/>
-                <w:color w:val="000000"/>
-                <w:sz w:val="22"/>
+                <w:sz w:val="16"/>
               </w:rPr>
               <w:t>50</w:t>
             </w:r>
@@ -522,22 +432,20 @@
       <w:tr>
         <w:tc>
           <w:tcPr>
-            <w:tcW w:type="dxa" w:w="4500"/>
-            <w:tcMar>
-              <w:top w:w="80" w:type="dxa"/>
-              <w:start w:w="120" w:type="dxa"/>
-              <w:bottom w:w="80" w:type="dxa"/>
-              <w:end w:w="120" w:type="dxa"/>
-            </w:tcMar>
+            <w:tcW w:type="dxa" w:w="5040"/>
+            <w:vAlign w:val="center"/>
           </w:tcPr>
           <w:p>
+            <w:pPr>
+              <w:spacing w:after="20"/>
+              <w:jc w:val="center"/>
+            </w:pPr>
             <w:r>
               <w:rPr>
-                <w:rFonts w:ascii="Calibri" w:hAnsi="Calibri"/>
+                <w:rFonts w:ascii="Times New Roman" w:hAnsi="Times New Roman"/>
                 <w:b w:val="0"/>
                 <w:i w:val="0"/>
-                <w:color w:val="000000"/>
-                <w:sz w:val="22"/>
+                <w:sz w:val="16"/>
               </w:rPr>
               <w:t>Total sales</w:t>
             </w:r>
@@ -545,22 +453,20 @@
         </w:tc>
         <w:tc>
           <w:tcPr>
-            <w:tcW w:type="dxa" w:w="4860"/>
-            <w:tcMar>
-              <w:top w:w="80" w:type="dxa"/>
-              <w:start w:w="120" w:type="dxa"/>
-              <w:bottom w:w="80" w:type="dxa"/>
-              <w:end w:w="120" w:type="dxa"/>
-            </w:tcMar>
+            <w:tcW w:type="dxa" w:w="5040"/>
+            <w:vAlign w:val="center"/>
           </w:tcPr>
           <w:p>
+            <w:pPr>
+              <w:spacing w:after="20"/>
+              <w:jc w:val="center"/>
+            </w:pPr>
             <w:r>
               <w:rPr>
-                <w:rFonts w:ascii="Calibri" w:hAnsi="Calibri"/>
+                <w:rFonts w:ascii="Times New Roman" w:hAnsi="Times New Roman"/>
                 <w:b w:val="0"/>
                 <w:i w:val="0"/>
-                <w:color w:val="000000"/>
-                <w:sz w:val="22"/>
+                <w:sz w:val="16"/>
               </w:rPr>
               <w:t>$36.78M</w:t>
             </w:r>
@@ -570,22 +476,20 @@
       <w:tr>
         <w:tc>
           <w:tcPr>
-            <w:tcW w:type="dxa" w:w="4500"/>
-            <w:tcMar>
-              <w:top w:w="80" w:type="dxa"/>
-              <w:start w:w="120" w:type="dxa"/>
-              <w:bottom w:w="80" w:type="dxa"/>
-              <w:end w:w="120" w:type="dxa"/>
-            </w:tcMar>
+            <w:tcW w:type="dxa" w:w="5040"/>
+            <w:vAlign w:val="center"/>
           </w:tcPr>
           <w:p>
+            <w:pPr>
+              <w:spacing w:after="20"/>
+              <w:jc w:val="center"/>
+            </w:pPr>
             <w:r>
               <w:rPr>
-                <w:rFonts w:ascii="Calibri" w:hAnsi="Calibri"/>
+                <w:rFonts w:ascii="Times New Roman" w:hAnsi="Times New Roman"/>
                 <w:b w:val="0"/>
                 <w:i w:val="0"/>
-                <w:color w:val="000000"/>
-                <w:sz w:val="22"/>
+                <w:sz w:val="16"/>
               </w:rPr>
               <w:t>Total profit</w:t>
             </w:r>
@@ -593,22 +497,20 @@
         </w:tc>
         <w:tc>
           <w:tcPr>
-            <w:tcW w:type="dxa" w:w="4860"/>
-            <w:tcMar>
-              <w:top w:w="80" w:type="dxa"/>
-              <w:start w:w="120" w:type="dxa"/>
-              <w:bottom w:w="80" w:type="dxa"/>
-              <w:end w:w="120" w:type="dxa"/>
-            </w:tcMar>
+            <w:tcW w:type="dxa" w:w="5040"/>
+            <w:vAlign w:val="center"/>
           </w:tcPr>
           <w:p>
+            <w:pPr>
+              <w:spacing w:after="20"/>
+              <w:jc w:val="center"/>
+            </w:pPr>
             <w:r>
               <w:rPr>
-                <w:rFonts w:ascii="Calibri" w:hAnsi="Calibri"/>
+                <w:rFonts w:ascii="Times New Roman" w:hAnsi="Times New Roman"/>
                 <w:b w:val="0"/>
                 <w:i w:val="0"/>
-                <w:color w:val="000000"/>
-                <w:sz w:val="22"/>
+                <w:sz w:val="16"/>
               </w:rPr>
               <w:t>$3.97M</w:t>
             </w:r>
@@ -618,45 +520,41 @@
       <w:tr>
         <w:tc>
           <w:tcPr>
-            <w:tcW w:type="dxa" w:w="4500"/>
-            <w:tcMar>
-              <w:top w:w="80" w:type="dxa"/>
-              <w:start w:w="120" w:type="dxa"/>
-              <w:bottom w:w="80" w:type="dxa"/>
-              <w:end w:w="120" w:type="dxa"/>
-            </w:tcMar>
+            <w:tcW w:type="dxa" w:w="5040"/>
+            <w:vAlign w:val="center"/>
           </w:tcPr>
           <w:p>
+            <w:pPr>
+              <w:spacing w:after="20"/>
+              <w:jc w:val="center"/>
+            </w:pPr>
             <w:r>
               <w:rPr>
-                <w:rFonts w:ascii="Calibri" w:hAnsi="Calibri"/>
+                <w:rFonts w:ascii="Times New Roman" w:hAnsi="Times New Roman"/>
                 <w:b w:val="0"/>
                 <w:i w:val="0"/>
-                <w:color w:val="000000"/>
-                <w:sz w:val="22"/>
+                <w:sz w:val="16"/>
               </w:rPr>
-              <w:t>Overall profit margin</w:t>
+              <w:t>Profit margin</w:t>
             </w:r>
           </w:p>
         </w:tc>
         <w:tc>
           <w:tcPr>
-            <w:tcW w:type="dxa" w:w="4860"/>
-            <w:tcMar>
-              <w:top w:w="80" w:type="dxa"/>
-              <w:start w:w="120" w:type="dxa"/>
-              <w:bottom w:w="80" w:type="dxa"/>
-              <w:end w:w="120" w:type="dxa"/>
-            </w:tcMar>
+            <w:tcW w:type="dxa" w:w="5040"/>
+            <w:vAlign w:val="center"/>
           </w:tcPr>
           <w:p>
+            <w:pPr>
+              <w:spacing w:after="20"/>
+              <w:jc w:val="center"/>
+            </w:pPr>
             <w:r>
               <w:rPr>
-                <w:rFonts w:ascii="Calibri" w:hAnsi="Calibri"/>
+                <w:rFonts w:ascii="Times New Roman" w:hAnsi="Times New Roman"/>
                 <w:b w:val="0"/>
                 <w:i w:val="0"/>
-                <w:color w:val="000000"/>
-                <w:sz w:val="22"/>
+                <w:sz w:val="16"/>
               </w:rPr>
               <w:t>10.8%</w:t>
             </w:r>
@@ -666,71 +564,57 @@
     </w:tbl>
     <w:p>
       <w:pPr>
-        <w:spacing w:before="40" w:after="160"/>
+        <w:spacing w:before="20" w:after="80"/>
         <w:jc w:val="center"/>
       </w:pPr>
       <w:r>
         <w:rPr>
-          <w:rFonts w:ascii="Calibri" w:hAnsi="Calibri"/>
+          <w:rFonts w:ascii="Times New Roman" w:hAnsi="Times New Roman"/>
           <w:b w:val="0"/>
-          <w:i/>
-          <w:color w:val="595959"/>
-          <w:sz w:val="18"/>
+          <w:i w:val="0"/>
+          <w:sz w:val="16"/>
         </w:rPr>
-        <w:t>Table 1. Dataset profile and baseline financial results. Source: APL_Logistics.csv.</w:t>
+        <w:t>TABLE I</w:t>
+        <w:br/>
+        <w:t>DATASET PROFILE AND BASELINE RESULTS</w:t>
       </w:r>
     </w:p>
     <w:p>
       <w:pPr>
-        <w:spacing w:after="160" w:line="319" w:lineRule="auto"/>
-        <w:jc w:val="both"/>
+        <w:keepNext/>
+        <w:spacing w:before="160" w:after="80"/>
+        <w:jc w:val="center"/>
       </w:pPr>
       <w:r>
         <w:rPr>
-          <w:rFonts w:ascii="Calibri" w:hAnsi="Calibri"/>
-          <w:b w:val="0"/>
+          <w:rFonts w:ascii="Times New Roman" w:hAnsi="Times New Roman"/>
+          <w:b/>
           <w:i w:val="0"/>
-          <w:color w:val="000000"/>
-          <w:sz w:val="22"/>
+          <w:sz w:val="20"/>
         </w:rPr>
-        <w:t>The dashboard reports total revenue, total profit, profit margin, and average discount as headline indicators. It provides market, customer, product, category, and discount analyses, including a product selector, top and bottom customer views, a category-market heatmap, and a discount scenario calculator. Because the source file does not contain an order-date field, the study does not make time-series claims or use trend forecasting.</w:t>
+        <w:t>III. EXPLORATORY DATA ANALYSIS</w:t>
       </w:r>
     </w:p>
     <w:p>
       <w:pPr>
-        <w:spacing w:before="360" w:after="200"/>
+        <w:spacing w:before="40" w:after="40" w:line="240" w:lineRule="auto"/>
+        <w:jc w:val="left"/>
       </w:pPr>
       <w:r>
         <w:rPr>
-          <w:rFonts w:ascii="Calibri" w:hAnsi="Calibri"/>
-          <w:b/>
+          <w:rFonts w:ascii="Times New Roman" w:hAnsi="Times New Roman"/>
+          <w:b w:val="0"/>
           <w:i w:val="0"/>
-          <w:color w:val="2E74B5"/>
-          <w:sz w:val="32"/>
+          <w:sz w:val="20"/>
         </w:rPr>
-        <w:t>3. Exploratory Data Analysis and Findings</w:t>
-      </w:r>
-    </w:p>
-    <w:p>
-      <w:pPr>
-        <w:spacing w:before="240" w:after="120"/>
-      </w:pPr>
-      <w:r>
-        <w:rPr>
-          <w:rFonts w:ascii="Calibri" w:hAnsi="Calibri"/>
-          <w:b/>
-          <w:i w:val="0"/>
-          <w:color w:val="1F4D78"/>
-          <w:sz w:val="26"/>
-        </w:rPr>
-        <w:t>3.1 Market performance</w:t>
+        <w:t>A. Market Performance</w:t>
       </w:r>
     </w:p>
     <w:p>
       <w:r>
         <w:drawing>
           <wp:inline xmlns:a="http://schemas.openxmlformats.org/drawingml/2006/main" xmlns:pic="http://schemas.openxmlformats.org/drawingml/2006/picture">
-            <wp:extent cx="5760720" cy="2834640"/>
+            <wp:extent cx="2907792" cy="1430818"/>
             <wp:docPr id="1" name="Picture 1"/>
             <wp:cNvGraphicFramePr>
               <a:graphicFrameLocks noChangeAspect="1"/>
@@ -743,7 +627,7 @@
                     <pic:cNvPicPr/>
                   </pic:nvPicPr>
                   <pic:blipFill>
-                    <a:blip r:embed="rId11"/>
+                    <a:blip r:embed="rId9"/>
                     <a:stretch>
                       <a:fillRect/>
                     </a:stretch>
@@ -751,7 +635,7 @@
                   <pic:spPr>
                     <a:xfrm>
                       <a:off x="0" y="0"/>
-                      <a:ext cx="5760720" cy="2834640"/>
+                      <a:ext cx="2907792" cy="1430818"/>
                     </a:xfrm>
                     <a:prstGeom prst="rect"/>
                   </pic:spPr>
@@ -764,56 +648,54 @@
     </w:p>
     <w:p>
       <w:pPr>
-        <w:spacing w:before="40" w:after="160"/>
+        <w:spacing w:before="20" w:after="80"/>
         <w:jc w:val="center"/>
       </w:pPr>
       <w:r>
         <w:rPr>
-          <w:rFonts w:ascii="Calibri" w:hAnsi="Calibri"/>
+          <w:rFonts w:ascii="Times New Roman" w:hAnsi="Times New Roman"/>
           <w:b w:val="0"/>
-          <w:i/>
-          <w:color w:val="595959"/>
-          <w:sz w:val="18"/>
+          <w:i w:val="0"/>
+          <w:sz w:val="16"/>
         </w:rPr>
-        <w:t>Figure 1. Profit by market. Source: APL_Logistics.csv; author calculations.</w:t>
+        <w:t>Fig. 1. Profit by market.</w:t>
       </w:r>
     </w:p>
     <w:p>
       <w:pPr>
-        <w:spacing w:after="160" w:line="319" w:lineRule="auto"/>
+        <w:spacing w:before="0" w:after="80" w:line="240" w:lineRule="auto"/>
         <w:jc w:val="both"/>
       </w:pPr>
       <w:r>
         <w:rPr>
-          <w:rFonts w:ascii="Calibri" w:hAnsi="Calibri"/>
+          <w:rFonts w:ascii="Times New Roman" w:hAnsi="Times New Roman"/>
           <w:b w:val="0"/>
           <w:i w:val="0"/>
-          <w:color w:val="000000"/>
-          <w:sz w:val="22"/>
+          <w:sz w:val="20"/>
         </w:rPr>
-        <w:t>Europe generated the highest total profit at $1.17M, followed by LATAM at $1.12M. Together, these two markets account for a substantial share of overall sales and profit. This concentration creates an opportunity to protect successful commercial patterns in the leading regions while examining whether similar practices can be adapted for smaller markets.</w:t>
+        <w:t>Europe generated the highest total profit at $1.17M, followed by LATAM at $1.12M. These markets account for a substantial share of sales and profit. Their performance should be protected while managers examine whether successful pricing, product, and customer practices can be adapted in smaller markets.</w:t>
       </w:r>
     </w:p>
     <w:p>
       <w:pPr>
-        <w:spacing w:before="240" w:after="120"/>
+        <w:spacing w:before="40" w:after="40" w:line="240" w:lineRule="auto"/>
+        <w:jc w:val="left"/>
       </w:pPr>
       <w:r>
         <w:rPr>
-          <w:rFonts w:ascii="Calibri" w:hAnsi="Calibri"/>
-          <w:b/>
+          <w:rFonts w:ascii="Times New Roman" w:hAnsi="Times New Roman"/>
+          <w:b w:val="0"/>
           <w:i w:val="0"/>
-          <w:color w:val="1F4D78"/>
-          <w:sz w:val="26"/>
+          <w:sz w:val="20"/>
         </w:rPr>
-        <w:t>3.2 Customer value by segment</w:t>
+        <w:t>B. Customer Value</w:t>
       </w:r>
     </w:p>
     <w:p>
       <w:r>
         <w:drawing>
           <wp:inline xmlns:a="http://schemas.openxmlformats.org/drawingml/2006/main" xmlns:pic="http://schemas.openxmlformats.org/drawingml/2006/picture">
-            <wp:extent cx="5760720" cy="2834640"/>
+            <wp:extent cx="2907792" cy="1430818"/>
             <wp:docPr id="2" name="Picture 2"/>
             <wp:cNvGraphicFramePr>
               <a:graphicFrameLocks noChangeAspect="1"/>
@@ -826,7 +708,7 @@
                     <pic:cNvPicPr/>
                   </pic:nvPicPr>
                   <pic:blipFill>
-                    <a:blip r:embed="rId12"/>
+                    <a:blip r:embed="rId10"/>
                     <a:stretch>
                       <a:fillRect/>
                     </a:stretch>
@@ -834,7 +716,7 @@
                   <pic:spPr>
                     <a:xfrm>
                       <a:off x="0" y="0"/>
-                      <a:ext cx="5760720" cy="2834640"/>
+                      <a:ext cx="2907792" cy="1430818"/>
                     </a:xfrm>
                     <a:prstGeom prst="rect"/>
                   </pic:spPr>
@@ -847,56 +729,54 @@
     </w:p>
     <w:p>
       <w:pPr>
-        <w:spacing w:before="40" w:after="160"/>
+        <w:spacing w:before="20" w:after="80"/>
         <w:jc w:val="center"/>
       </w:pPr>
       <w:r>
         <w:rPr>
-          <w:rFonts w:ascii="Calibri" w:hAnsi="Calibri"/>
+          <w:rFonts w:ascii="Times New Roman" w:hAnsi="Times New Roman"/>
           <w:b w:val="0"/>
-          <w:i/>
-          <w:color w:val="595959"/>
-          <w:sz w:val="18"/>
+          <w:i w:val="0"/>
+          <w:sz w:val="16"/>
         </w:rPr>
-        <w:t>Figure 2. Profit by customer segment. Source: APL_Logistics.csv; author calculations.</w:t>
+        <w:t>Fig. 2. Profit by customer segment.</w:t>
       </w:r>
     </w:p>
     <w:p>
       <w:pPr>
-        <w:spacing w:after="160" w:line="319" w:lineRule="auto"/>
+        <w:spacing w:before="0" w:after="80" w:line="240" w:lineRule="auto"/>
         <w:jc w:val="both"/>
       </w:pPr>
       <w:r>
         <w:rPr>
-          <w:rFonts w:ascii="Calibri" w:hAnsi="Calibri"/>
+          <w:rFonts w:ascii="Times New Roman" w:hAnsi="Times New Roman"/>
           <w:b w:val="0"/>
           <w:i w:val="0"/>
-          <w:color w:val="000000"/>
-          <w:sz w:val="22"/>
+          <w:sz w:val="20"/>
         </w:rPr>
-        <w:t>Customer segments differ in their aggregate value. Consumer generated the highest segment-level profit, while Home Office generated the lowest. The dashboard complements this aggregate view with top and bottom customer charts and an attention table for customers with above-median revenue but profit margins below 10%. These views support targeted pricing, retention, and account-management decisions.</w:t>
+        <w:t>Customer segments differ in aggregate contribution. Consumer customers generated the highest segment-level profit, while Home Office generated the lowest. The dashboard supplements this view with top and bottom customer charts and an attention table for customers with above-median revenue but margins below 10%. These measures support targeted account, retention, and pricing decisions.</w:t>
       </w:r>
     </w:p>
     <w:p>
       <w:pPr>
-        <w:spacing w:before="240" w:after="120"/>
+        <w:spacing w:before="40" w:after="40" w:line="240" w:lineRule="auto"/>
+        <w:jc w:val="left"/>
       </w:pPr>
       <w:r>
         <w:rPr>
-          <w:rFonts w:ascii="Calibri" w:hAnsi="Calibri"/>
-          <w:b/>
+          <w:rFonts w:ascii="Times New Roman" w:hAnsi="Times New Roman"/>
+          <w:b w:val="0"/>
           <w:i w:val="0"/>
-          <w:color w:val="1F4D78"/>
-          <w:sz w:val="26"/>
+          <w:sz w:val="20"/>
         </w:rPr>
-        <w:t>3.3 Discount and margin relationship</w:t>
+        <w:t>C. Discount and Margin Relationship</w:t>
       </w:r>
     </w:p>
     <w:p>
       <w:r>
         <w:drawing>
           <wp:inline xmlns:a="http://schemas.openxmlformats.org/drawingml/2006/main" xmlns:pic="http://schemas.openxmlformats.org/drawingml/2006/picture">
-            <wp:extent cx="5760720" cy="2834640"/>
+            <wp:extent cx="2907792" cy="1430818"/>
             <wp:docPr id="3" name="Picture 3"/>
             <wp:cNvGraphicFramePr>
               <a:graphicFrameLocks noChangeAspect="1"/>
@@ -909,7 +789,7 @@
                     <pic:cNvPicPr/>
                   </pic:nvPicPr>
                   <pic:blipFill>
-                    <a:blip r:embed="rId13"/>
+                    <a:blip r:embed="rId11"/>
                     <a:stretch>
                       <a:fillRect/>
                     </a:stretch>
@@ -917,7 +797,7 @@
                   <pic:spPr>
                     <a:xfrm>
                       <a:off x="0" y="0"/>
-                      <a:ext cx="5760720" cy="2834640"/>
+                      <a:ext cx="2907792" cy="1430818"/>
                     </a:xfrm>
                     <a:prstGeom prst="rect"/>
                   </pic:spPr>
@@ -930,84 +810,79 @@
     </w:p>
     <w:p>
       <w:pPr>
-        <w:spacing w:before="40" w:after="160"/>
+        <w:spacing w:before="20" w:after="80"/>
         <w:jc w:val="center"/>
       </w:pPr>
       <w:r>
         <w:rPr>
-          <w:rFonts w:ascii="Calibri" w:hAnsi="Calibri"/>
+          <w:rFonts w:ascii="Times New Roman" w:hAnsi="Times New Roman"/>
           <w:b w:val="0"/>
-          <w:i/>
-          <w:color w:val="595959"/>
-          <w:sz w:val="18"/>
+          <w:i w:val="0"/>
+          <w:sz w:val="16"/>
         </w:rPr>
-        <w:t>Figure 3. Profit margin by discount band. Source: APL_Logistics.csv; author calculations.</w:t>
+        <w:t>Fig. 3. Profit margin by discount band.</w:t>
       </w:r>
     </w:p>
     <w:p>
       <w:pPr>
-        <w:spacing w:after="160" w:line="319" w:lineRule="auto"/>
+        <w:spacing w:before="0" w:after="80" w:line="240" w:lineRule="auto"/>
         <w:jc w:val="both"/>
       </w:pPr>
       <w:r>
         <w:rPr>
-          <w:rFonts w:ascii="Calibri" w:hAnsi="Calibri"/>
+          <w:rFonts w:ascii="Times New Roman" w:hAnsi="Times New Roman"/>
           <w:b w:val="0"/>
           <w:i w:val="0"/>
-          <w:color w:val="000000"/>
-          <w:sz w:val="22"/>
+          <w:sz w:val="20"/>
         </w:rPr>
-        <w:t>Discounting is a material commercial lever: the average order-item discount rate was 10.2%. The margin comparison indicates that the No discount band has the strongest aggregate margin, whereas the &gt;20% band has the weakest. The dashboard therefore exposes discount rate and profitability together so commercial teams can check whether discount approvals are producing incremental value rather than simply reducing margin.</w:t>
+        <w:t>The average order-item discount is 10.2%. The no-discount band has the strongest aggregate margin, whereas the greater-than-20-percent band has the weakest. The dashboard exposes discount rate and profitability together and includes a what-if calculator that estimates the financial effect of a proposed uniform discount, holding observed per-line cost constant.</w:t>
       </w:r>
     </w:p>
     <w:p>
       <w:pPr>
-        <w:spacing w:before="240" w:after="120"/>
+        <w:spacing w:before="40" w:after="40" w:line="240" w:lineRule="auto"/>
+        <w:jc w:val="left"/>
       </w:pPr>
       <w:r>
         <w:rPr>
-          <w:rFonts w:ascii="Calibri" w:hAnsi="Calibri"/>
-          <w:b/>
+          <w:rFonts w:ascii="Times New Roman" w:hAnsi="Times New Roman"/>
+          <w:b w:val="0"/>
           <w:i w:val="0"/>
-          <w:color w:val="1F4D78"/>
-          <w:sz w:val="26"/>
+          <w:sz w:val="20"/>
         </w:rPr>
-        <w:t>3.4 Product category performance</w:t>
+        <w:t>D. Product and Category Performance</w:t>
       </w:r>
     </w:p>
     <w:tbl>
       <w:tblPr>
         <w:tblStyle w:val="TableGrid"/>
-        <w:tblW w:type="dxa" w:w="9360"/>
+        <w:tblW w:type="auto" w:w="0"/>
         <w:tblLayout w:type="fixed"/>
         <w:tblLook w:firstColumn="1" w:firstRow="1" w:lastColumn="0" w:lastRow="0" w:noHBand="0" w:noVBand="1" w:val="04A0"/>
-        <w:tblInd w:w="120" w:type="dxa"/>
       </w:tblPr>
       <w:tblGrid>
-        <w:gridCol w:w="4200"/>
-        <w:gridCol w:w="2580"/>
-        <w:gridCol w:w="2580"/>
+        <w:gridCol w:w="3360"/>
+        <w:gridCol w:w="3360"/>
+        <w:gridCol w:w="3360"/>
       </w:tblGrid>
       <w:tr>
         <w:tc>
           <w:tcPr>
-            <w:tcW w:type="dxa" w:w="4200"/>
-            <w:shd w:fill="F2F4F7"/>
-            <w:tcMar>
-              <w:top w:w="80" w:type="dxa"/>
-              <w:start w:w="120" w:type="dxa"/>
-              <w:bottom w:w="80" w:type="dxa"/>
-              <w:end w:w="120" w:type="dxa"/>
-            </w:tcMar>
+            <w:tcW w:type="dxa" w:w="3360"/>
+            <w:vAlign w:val="center"/>
+            <w:shd w:fill="D9E2F3"/>
           </w:tcPr>
           <w:p>
+            <w:pPr>
+              <w:spacing w:after="20"/>
+              <w:jc w:val="center"/>
+            </w:pPr>
             <w:r>
               <w:rPr>
-                <w:rFonts w:ascii="Calibri" w:hAnsi="Calibri"/>
+                <w:rFonts w:ascii="Times New Roman" w:hAnsi="Times New Roman"/>
                 <w:b/>
                 <w:i w:val="0"/>
-                <w:color w:val="1F4D78"/>
-                <w:sz w:val="22"/>
+                <w:sz w:val="16"/>
               </w:rPr>
               <w:t>Category</w:t>
             </w:r>
@@ -1015,23 +890,21 @@
         </w:tc>
         <w:tc>
           <w:tcPr>
-            <w:tcW w:type="dxa" w:w="2580"/>
-            <w:shd w:fill="F2F4F7"/>
-            <w:tcMar>
-              <w:top w:w="80" w:type="dxa"/>
-              <w:start w:w="120" w:type="dxa"/>
-              <w:bottom w:w="80" w:type="dxa"/>
-              <w:end w:w="120" w:type="dxa"/>
-            </w:tcMar>
+            <w:tcW w:type="dxa" w:w="3360"/>
+            <w:vAlign w:val="center"/>
+            <w:shd w:fill="D9E2F3"/>
           </w:tcPr>
           <w:p>
+            <w:pPr>
+              <w:spacing w:after="20"/>
+              <w:jc w:val="center"/>
+            </w:pPr>
             <w:r>
               <w:rPr>
-                <w:rFonts w:ascii="Calibri" w:hAnsi="Calibri"/>
+                <w:rFonts w:ascii="Times New Roman" w:hAnsi="Times New Roman"/>
                 <w:b/>
                 <w:i w:val="0"/>
-                <w:color w:val="1F4D78"/>
-                <w:sz w:val="22"/>
+                <w:sz w:val="16"/>
               </w:rPr>
               <w:t>Sales</w:t>
             </w:r>
@@ -1039,23 +912,21 @@
         </w:tc>
         <w:tc>
           <w:tcPr>
-            <w:tcW w:type="dxa" w:w="2580"/>
-            <w:shd w:fill="F2F4F7"/>
-            <w:tcMar>
-              <w:top w:w="80" w:type="dxa"/>
-              <w:start w:w="120" w:type="dxa"/>
-              <w:bottom w:w="80" w:type="dxa"/>
-              <w:end w:w="120" w:type="dxa"/>
-            </w:tcMar>
+            <w:tcW w:type="dxa" w:w="3360"/>
+            <w:vAlign w:val="center"/>
+            <w:shd w:fill="D9E2F3"/>
           </w:tcPr>
           <w:p>
+            <w:pPr>
+              <w:spacing w:after="20"/>
+              <w:jc w:val="center"/>
+            </w:pPr>
             <w:r>
               <w:rPr>
-                <w:rFonts w:ascii="Calibri" w:hAnsi="Calibri"/>
+                <w:rFonts w:ascii="Times New Roman" w:hAnsi="Times New Roman"/>
                 <w:b/>
                 <w:i w:val="0"/>
-                <w:color w:val="1F4D78"/>
-                <w:sz w:val="22"/>
+                <w:sz w:val="16"/>
               </w:rPr>
               <w:t>Profit</w:t>
             </w:r>
@@ -1065,22 +936,20 @@
       <w:tr>
         <w:tc>
           <w:tcPr>
-            <w:tcW w:type="dxa" w:w="4200"/>
-            <w:tcMar>
-              <w:top w:w="80" w:type="dxa"/>
-              <w:start w:w="120" w:type="dxa"/>
-              <w:bottom w:w="80" w:type="dxa"/>
-              <w:end w:w="120" w:type="dxa"/>
-            </w:tcMar>
+            <w:tcW w:type="dxa" w:w="3360"/>
+            <w:vAlign w:val="center"/>
           </w:tcPr>
           <w:p>
+            <w:pPr>
+              <w:spacing w:after="20"/>
+              <w:jc w:val="center"/>
+            </w:pPr>
             <w:r>
               <w:rPr>
-                <w:rFonts w:ascii="Calibri" w:hAnsi="Calibri"/>
+                <w:rFonts w:ascii="Times New Roman" w:hAnsi="Times New Roman"/>
                 <w:b w:val="0"/>
                 <w:i w:val="0"/>
-                <w:color w:val="000000"/>
-                <w:sz w:val="22"/>
+                <w:sz w:val="16"/>
               </w:rPr>
               <w:t>Fishing</w:t>
             </w:r>
@@ -1088,22 +957,20 @@
         </w:tc>
         <w:tc>
           <w:tcPr>
-            <w:tcW w:type="dxa" w:w="2580"/>
-            <w:tcMar>
-              <w:top w:w="80" w:type="dxa"/>
-              <w:start w:w="120" w:type="dxa"/>
-              <w:bottom w:w="80" w:type="dxa"/>
-              <w:end w:w="120" w:type="dxa"/>
-            </w:tcMar>
+            <w:tcW w:type="dxa" w:w="3360"/>
+            <w:vAlign w:val="center"/>
           </w:tcPr>
           <w:p>
+            <w:pPr>
+              <w:spacing w:after="20"/>
+              <w:jc w:val="center"/>
+            </w:pPr>
             <w:r>
               <w:rPr>
-                <w:rFonts w:ascii="Calibri" w:hAnsi="Calibri"/>
+                <w:rFonts w:ascii="Times New Roman" w:hAnsi="Times New Roman"/>
                 <w:b w:val="0"/>
                 <w:i w:val="0"/>
-                <w:color w:val="000000"/>
-                <w:sz w:val="22"/>
+                <w:sz w:val="16"/>
               </w:rPr>
               <w:t>$6.93M</w:t>
             </w:r>
@@ -1111,22 +978,20 @@
         </w:tc>
         <w:tc>
           <w:tcPr>
-            <w:tcW w:type="dxa" w:w="2580"/>
-            <w:tcMar>
-              <w:top w:w="80" w:type="dxa"/>
-              <w:start w:w="120" w:type="dxa"/>
-              <w:bottom w:w="80" w:type="dxa"/>
-              <w:end w:w="120" w:type="dxa"/>
-            </w:tcMar>
+            <w:tcW w:type="dxa" w:w="3360"/>
+            <w:vAlign w:val="center"/>
           </w:tcPr>
           <w:p>
+            <w:pPr>
+              <w:spacing w:after="20"/>
+              <w:jc w:val="center"/>
+            </w:pPr>
             <w:r>
               <w:rPr>
-                <w:rFonts w:ascii="Calibri" w:hAnsi="Calibri"/>
+                <w:rFonts w:ascii="Times New Roman" w:hAnsi="Times New Roman"/>
                 <w:b w:val="0"/>
                 <w:i w:val="0"/>
-                <w:color w:val="000000"/>
-                <w:sz w:val="22"/>
+                <w:sz w:val="16"/>
               </w:rPr>
               <w:t>$0.76M</w:t>
             </w:r>
@@ -1136,22 +1001,20 @@
       <w:tr>
         <w:tc>
           <w:tcPr>
-            <w:tcW w:type="dxa" w:w="4200"/>
-            <w:tcMar>
-              <w:top w:w="80" w:type="dxa"/>
-              <w:start w:w="120" w:type="dxa"/>
-              <w:bottom w:w="80" w:type="dxa"/>
-              <w:end w:w="120" w:type="dxa"/>
-            </w:tcMar>
+            <w:tcW w:type="dxa" w:w="3360"/>
+            <w:vAlign w:val="center"/>
           </w:tcPr>
           <w:p>
+            <w:pPr>
+              <w:spacing w:after="20"/>
+              <w:jc w:val="center"/>
+            </w:pPr>
             <w:r>
               <w:rPr>
-                <w:rFonts w:ascii="Calibri" w:hAnsi="Calibri"/>
+                <w:rFonts w:ascii="Times New Roman" w:hAnsi="Times New Roman"/>
                 <w:b w:val="0"/>
                 <w:i w:val="0"/>
-                <w:color w:val="000000"/>
-                <w:sz w:val="22"/>
+                <w:sz w:val="16"/>
               </w:rPr>
               <w:t>Cleats</w:t>
             </w:r>
@@ -1159,22 +1022,20 @@
         </w:tc>
         <w:tc>
           <w:tcPr>
-            <w:tcW w:type="dxa" w:w="2580"/>
-            <w:tcMar>
-              <w:top w:w="80" w:type="dxa"/>
-              <w:start w:w="120" w:type="dxa"/>
-              <w:bottom w:w="80" w:type="dxa"/>
-              <w:end w:w="120" w:type="dxa"/>
-            </w:tcMar>
+            <w:tcW w:type="dxa" w:w="3360"/>
+            <w:vAlign w:val="center"/>
           </w:tcPr>
           <w:p>
+            <w:pPr>
+              <w:spacing w:after="20"/>
+              <w:jc w:val="center"/>
+            </w:pPr>
             <w:r>
               <w:rPr>
-                <w:rFonts w:ascii="Calibri" w:hAnsi="Calibri"/>
+                <w:rFonts w:ascii="Times New Roman" w:hAnsi="Times New Roman"/>
                 <w:b w:val="0"/>
                 <w:i w:val="0"/>
-                <w:color w:val="000000"/>
-                <w:sz w:val="22"/>
+                <w:sz w:val="16"/>
               </w:rPr>
               <w:t>$4.43M</w:t>
             </w:r>
@@ -1182,22 +1043,20 @@
         </w:tc>
         <w:tc>
           <w:tcPr>
-            <w:tcW w:type="dxa" w:w="2580"/>
-            <w:tcMar>
-              <w:top w:w="80" w:type="dxa"/>
-              <w:start w:w="120" w:type="dxa"/>
-              <w:bottom w:w="80" w:type="dxa"/>
-              <w:end w:w="120" w:type="dxa"/>
-            </w:tcMar>
+            <w:tcW w:type="dxa" w:w="3360"/>
+            <w:vAlign w:val="center"/>
           </w:tcPr>
           <w:p>
+            <w:pPr>
+              <w:spacing w:after="20"/>
+              <w:jc w:val="center"/>
+            </w:pPr>
             <w:r>
               <w:rPr>
-                <w:rFonts w:ascii="Calibri" w:hAnsi="Calibri"/>
+                <w:rFonts w:ascii="Times New Roman" w:hAnsi="Times New Roman"/>
                 <w:b w:val="0"/>
                 <w:i w:val="0"/>
-                <w:color w:val="000000"/>
-                <w:sz w:val="22"/>
+                <w:sz w:val="16"/>
               </w:rPr>
               <w:t>$0.49M</w:t>
             </w:r>
@@ -1207,22 +1066,20 @@
       <w:tr>
         <w:tc>
           <w:tcPr>
-            <w:tcW w:type="dxa" w:w="4200"/>
-            <w:tcMar>
-              <w:top w:w="80" w:type="dxa"/>
-              <w:start w:w="120" w:type="dxa"/>
-              <w:bottom w:w="80" w:type="dxa"/>
-              <w:end w:w="120" w:type="dxa"/>
-            </w:tcMar>
+            <w:tcW w:type="dxa" w:w="3360"/>
+            <w:vAlign w:val="center"/>
           </w:tcPr>
           <w:p>
+            <w:pPr>
+              <w:spacing w:after="20"/>
+              <w:jc w:val="center"/>
+            </w:pPr>
             <w:r>
               <w:rPr>
-                <w:rFonts w:ascii="Calibri" w:hAnsi="Calibri"/>
+                <w:rFonts w:ascii="Times New Roman" w:hAnsi="Times New Roman"/>
                 <w:b w:val="0"/>
                 <w:i w:val="0"/>
-                <w:color w:val="000000"/>
-                <w:sz w:val="22"/>
+                <w:sz w:val="16"/>
               </w:rPr>
               <w:t>Camping &amp; Hiking</w:t>
             </w:r>
@@ -1230,22 +1087,20 @@
         </w:tc>
         <w:tc>
           <w:tcPr>
-            <w:tcW w:type="dxa" w:w="2580"/>
-            <w:tcMar>
-              <w:top w:w="80" w:type="dxa"/>
-              <w:start w:w="120" w:type="dxa"/>
-              <w:bottom w:w="80" w:type="dxa"/>
-              <w:end w:w="120" w:type="dxa"/>
-            </w:tcMar>
+            <w:tcW w:type="dxa" w:w="3360"/>
+            <w:vAlign w:val="center"/>
           </w:tcPr>
           <w:p>
+            <w:pPr>
+              <w:spacing w:after="20"/>
+              <w:jc w:val="center"/>
+            </w:pPr>
             <w:r>
               <w:rPr>
-                <w:rFonts w:ascii="Calibri" w:hAnsi="Calibri"/>
+                <w:rFonts w:ascii="Times New Roman" w:hAnsi="Times New Roman"/>
                 <w:b w:val="0"/>
                 <w:i w:val="0"/>
-                <w:color w:val="000000"/>
-                <w:sz w:val="22"/>
+                <w:sz w:val="16"/>
               </w:rPr>
               <w:t>$4.12M</w:t>
             </w:r>
@@ -1253,22 +1108,20 @@
         </w:tc>
         <w:tc>
           <w:tcPr>
-            <w:tcW w:type="dxa" w:w="2580"/>
-            <w:tcMar>
-              <w:top w:w="80" w:type="dxa"/>
-              <w:start w:w="120" w:type="dxa"/>
-              <w:bottom w:w="80" w:type="dxa"/>
-              <w:end w:w="120" w:type="dxa"/>
-            </w:tcMar>
+            <w:tcW w:type="dxa" w:w="3360"/>
+            <w:vAlign w:val="center"/>
           </w:tcPr>
           <w:p>
+            <w:pPr>
+              <w:spacing w:after="20"/>
+              <w:jc w:val="center"/>
+            </w:pPr>
             <w:r>
               <w:rPr>
-                <w:rFonts w:ascii="Calibri" w:hAnsi="Calibri"/>
+                <w:rFonts w:ascii="Times New Roman" w:hAnsi="Times New Roman"/>
                 <w:b w:val="0"/>
                 <w:i w:val="0"/>
-                <w:color w:val="000000"/>
-                <w:sz w:val="22"/>
+                <w:sz w:val="16"/>
               </w:rPr>
               <w:t>$0.43M</w:t>
             </w:r>
@@ -1278,22 +1131,20 @@
       <w:tr>
         <w:tc>
           <w:tcPr>
-            <w:tcW w:type="dxa" w:w="4200"/>
-            <w:tcMar>
-              <w:top w:w="80" w:type="dxa"/>
-              <w:start w:w="120" w:type="dxa"/>
-              <w:bottom w:w="80" w:type="dxa"/>
-              <w:end w:w="120" w:type="dxa"/>
-            </w:tcMar>
+            <w:tcW w:type="dxa" w:w="3360"/>
+            <w:vAlign w:val="center"/>
           </w:tcPr>
           <w:p>
+            <w:pPr>
+              <w:spacing w:after="20"/>
+              <w:jc w:val="center"/>
+            </w:pPr>
             <w:r>
               <w:rPr>
-                <w:rFonts w:ascii="Calibri" w:hAnsi="Calibri"/>
+                <w:rFonts w:ascii="Times New Roman" w:hAnsi="Times New Roman"/>
                 <w:b w:val="0"/>
                 <w:i w:val="0"/>
-                <w:color w:val="000000"/>
-                <w:sz w:val="22"/>
+                <w:sz w:val="16"/>
               </w:rPr>
               <w:t>Cardio Equipment</w:t>
             </w:r>
@@ -1301,22 +1152,20 @@
         </w:tc>
         <w:tc>
           <w:tcPr>
-            <w:tcW w:type="dxa" w:w="2580"/>
-            <w:tcMar>
-              <w:top w:w="80" w:type="dxa"/>
-              <w:start w:w="120" w:type="dxa"/>
-              <w:bottom w:w="80" w:type="dxa"/>
-              <w:end w:w="120" w:type="dxa"/>
-            </w:tcMar>
+            <w:tcW w:type="dxa" w:w="3360"/>
+            <w:vAlign w:val="center"/>
           </w:tcPr>
           <w:p>
+            <w:pPr>
+              <w:spacing w:after="20"/>
+              <w:jc w:val="center"/>
+            </w:pPr>
             <w:r>
               <w:rPr>
-                <w:rFonts w:ascii="Calibri" w:hAnsi="Calibri"/>
+                <w:rFonts w:ascii="Times New Roman" w:hAnsi="Times New Roman"/>
                 <w:b w:val="0"/>
                 <w:i w:val="0"/>
-                <w:color w:val="000000"/>
-                <w:sz w:val="22"/>
+                <w:sz w:val="16"/>
               </w:rPr>
               <w:t>$3.69M</w:t>
             </w:r>
@@ -1324,22 +1173,20 @@
         </w:tc>
         <w:tc>
           <w:tcPr>
-            <w:tcW w:type="dxa" w:w="2580"/>
-            <w:tcMar>
-              <w:top w:w="80" w:type="dxa"/>
-              <w:start w:w="120" w:type="dxa"/>
-              <w:bottom w:w="80" w:type="dxa"/>
-              <w:end w:w="120" w:type="dxa"/>
-            </w:tcMar>
+            <w:tcW w:type="dxa" w:w="3360"/>
+            <w:vAlign w:val="center"/>
           </w:tcPr>
           <w:p>
+            <w:pPr>
+              <w:spacing w:after="20"/>
+              <w:jc w:val="center"/>
+            </w:pPr>
             <w:r>
               <w:rPr>
-                <w:rFonts w:ascii="Calibri" w:hAnsi="Calibri"/>
+                <w:rFonts w:ascii="Times New Roman" w:hAnsi="Times New Roman"/>
                 <w:b w:val="0"/>
                 <w:i w:val="0"/>
-                <w:color w:val="000000"/>
-                <w:sz w:val="22"/>
+                <w:sz w:val="16"/>
               </w:rPr>
               <w:t>$0.38M</w:t>
             </w:r>
@@ -1349,22 +1196,20 @@
       <w:tr>
         <w:tc>
           <w:tcPr>
-            <w:tcW w:type="dxa" w:w="4200"/>
-            <w:tcMar>
-              <w:top w:w="80" w:type="dxa"/>
-              <w:start w:w="120" w:type="dxa"/>
-              <w:bottom w:w="80" w:type="dxa"/>
-              <w:end w:w="120" w:type="dxa"/>
-            </w:tcMar>
+            <w:tcW w:type="dxa" w:w="3360"/>
+            <w:vAlign w:val="center"/>
           </w:tcPr>
           <w:p>
+            <w:pPr>
+              <w:spacing w:after="20"/>
+              <w:jc w:val="center"/>
+            </w:pPr>
             <w:r>
               <w:rPr>
-                <w:rFonts w:ascii="Calibri" w:hAnsi="Calibri"/>
+                <w:rFonts w:ascii="Times New Roman" w:hAnsi="Times New Roman"/>
                 <w:b w:val="0"/>
                 <w:i w:val="0"/>
-                <w:color w:val="000000"/>
-                <w:sz w:val="22"/>
+                <w:sz w:val="16"/>
               </w:rPr>
               <w:t>Women's Apparel</w:t>
             </w:r>
@@ -1372,22 +1217,20 @@
         </w:tc>
         <w:tc>
           <w:tcPr>
-            <w:tcW w:type="dxa" w:w="2580"/>
-            <w:tcMar>
-              <w:top w:w="80" w:type="dxa"/>
-              <w:start w:w="120" w:type="dxa"/>
-              <w:bottom w:w="80" w:type="dxa"/>
-              <w:end w:w="120" w:type="dxa"/>
-            </w:tcMar>
+            <w:tcW w:type="dxa" w:w="3360"/>
+            <w:vAlign w:val="center"/>
           </w:tcPr>
           <w:p>
+            <w:pPr>
+              <w:spacing w:after="20"/>
+              <w:jc w:val="center"/>
+            </w:pPr>
             <w:r>
               <w:rPr>
-                <w:rFonts w:ascii="Calibri" w:hAnsi="Calibri"/>
+                <w:rFonts w:ascii="Times New Roman" w:hAnsi="Times New Roman"/>
                 <w:b w:val="0"/>
                 <w:i w:val="0"/>
-                <w:color w:val="000000"/>
-                <w:sz w:val="22"/>
+                <w:sz w:val="16"/>
               </w:rPr>
               <w:t>$3.15M</w:t>
             </w:r>
@@ -1395,22 +1238,20 @@
         </w:tc>
         <w:tc>
           <w:tcPr>
-            <w:tcW w:type="dxa" w:w="2580"/>
-            <w:tcMar>
-              <w:top w:w="80" w:type="dxa"/>
-              <w:start w:w="120" w:type="dxa"/>
-              <w:bottom w:w="80" w:type="dxa"/>
-              <w:end w:w="120" w:type="dxa"/>
-            </w:tcMar>
+            <w:tcW w:type="dxa" w:w="3360"/>
+            <w:vAlign w:val="center"/>
           </w:tcPr>
           <w:p>
+            <w:pPr>
+              <w:spacing w:after="20"/>
+              <w:jc w:val="center"/>
+            </w:pPr>
             <w:r>
               <w:rPr>
-                <w:rFonts w:ascii="Calibri" w:hAnsi="Calibri"/>
+                <w:rFonts w:ascii="Times New Roman" w:hAnsi="Times New Roman"/>
                 <w:b w:val="0"/>
                 <w:i w:val="0"/>
-                <w:color w:val="000000"/>
-                <w:sz w:val="22"/>
+                <w:sz w:val="16"/>
               </w:rPr>
               <w:t>$0.35M</w:t>
             </w:r>
@@ -1420,395 +1261,249 @@
     </w:tbl>
     <w:p>
       <w:pPr>
-        <w:spacing w:before="40" w:after="160"/>
+        <w:spacing w:before="20" w:after="80"/>
         <w:jc w:val="center"/>
       </w:pPr>
       <w:r>
         <w:rPr>
-          <w:rFonts w:ascii="Calibri" w:hAnsi="Calibri"/>
+          <w:rFonts w:ascii="Times New Roman" w:hAnsi="Times New Roman"/>
           <w:b w:val="0"/>
-          <w:i/>
-          <w:color w:val="595959"/>
-          <w:sz w:val="18"/>
+          <w:i w:val="0"/>
+          <w:sz w:val="16"/>
         </w:rPr>
-        <w:t>Table 2. Five highest-profit product categories. Source: APL_Logistics.csv; author calculations.</w:t>
+        <w:t>TABLE II</w:t>
+        <w:br/>
+        <w:t>HIGHEST PROFIT PRODUCT CATEGORIES</w:t>
       </w:r>
     </w:p>
     <w:p>
       <w:pPr>
-        <w:spacing w:after="160" w:line="319" w:lineRule="auto"/>
+        <w:spacing w:before="0" w:after="80" w:line="240" w:lineRule="auto"/>
         <w:jc w:val="both"/>
       </w:pPr>
       <w:r>
         <w:rPr>
-          <w:rFonts w:ascii="Calibri" w:hAnsi="Calibri"/>
+          <w:rFonts w:ascii="Times New Roman" w:hAnsi="Times New Roman"/>
           <w:b w:val="0"/>
           <w:i w:val="0"/>
-          <w:color w:val="000000"/>
-          <w:sz w:val="22"/>
+          <w:sz w:val="20"/>
         </w:rPr>
-        <w:t>Fishing is the largest profit contributor ($0.76M), followed by Cleats and Camping &amp; Hiking. These categories should be treated as strategic performance segments: they need disciplined availability, pricing, and promotion monitoring. Lower-volume or lower-margin categories should be reviewed using the dashboard before additional promotional spending is approved.</w:t>
+        <w:t>Fishing is the largest profit contributor, followed by Cleats and Camping &amp; Hiking. These categories should receive disciplined pricing, promotion, and availability monitoring. Lower-margin products can be identified through the product-level margin analysis before additional promotions are approved.</w:t>
       </w:r>
     </w:p>
     <w:p>
       <w:pPr>
-        <w:spacing w:before="360" w:after="200"/>
+        <w:keepNext/>
+        <w:spacing w:before="160" w:after="80"/>
+        <w:jc w:val="center"/>
       </w:pPr>
       <w:r>
         <w:rPr>
-          <w:rFonts w:ascii="Calibri" w:hAnsi="Calibri"/>
+          <w:rFonts w:ascii="Times New Roman" w:hAnsi="Times New Roman"/>
           <w:b/>
           <w:i w:val="0"/>
-          <w:color w:val="2E74B5"/>
-          <w:sz w:val="32"/>
+          <w:sz w:val="20"/>
         </w:rPr>
-        <w:t>4. Recommendations</w:t>
+        <w:t>IV. RECOMMENDATIONS</w:t>
       </w:r>
     </w:p>
     <w:p>
       <w:pPr>
-        <w:spacing w:after="160" w:line="319" w:lineRule="auto"/>
+        <w:spacing w:before="0" w:after="80" w:line="240" w:lineRule="auto"/>
         <w:jc w:val="both"/>
       </w:pPr>
       <w:r>
         <w:rPr>
-          <w:rFonts w:ascii="Calibri" w:hAnsi="Calibri"/>
-          <w:b/>
-          <w:i w:val="0"/>
-          <w:color w:val="000000"/>
-          <w:sz w:val="22"/>
-        </w:rPr>
-        <w:t xml:space="preserve">Recommendation 1: </w:t>
-      </w:r>
-      <w:r>
-        <w:rPr>
-          <w:rFonts w:ascii="Calibri" w:hAnsi="Calibri"/>
+          <w:rFonts w:ascii="Times New Roman" w:hAnsi="Times New Roman"/>
           <w:b w:val="0"/>
           <w:i w:val="0"/>
-          <w:color w:val="000000"/>
-          <w:sz w:val="22"/>
+          <w:sz w:val="20"/>
         </w:rPr>
-        <w:t>Establish discount guardrails. Define category- and customer-segment-specific discount thresholds, require approval for high-discount orders, and monitor the resulting margin weekly. The objective is to preserve profitable demand while limiting margin dilution.</w:t>
+        <w:t>First, establish category- and customer-segment-specific discount thresholds, require approval for high discounts, and review margin weekly. Second, group customers into value tiers using total profit, profit margin, and line-item volume, then adapt pricing and account-management actions by tier. Third, protect the availability and promotion discipline of high-value categories and markets. Finally, use the dashboard in a recurring management review that assigns ownership for adverse movements in profit, margin, discount, customer value, or category-market performance.</w:t>
       </w:r>
     </w:p>
     <w:p>
       <w:pPr>
-        <w:spacing w:after="160" w:line="319" w:lineRule="auto"/>
+        <w:keepNext/>
+        <w:spacing w:before="160" w:after="80"/>
+        <w:jc w:val="center"/>
+      </w:pPr>
+      <w:r>
+        <w:rPr>
+          <w:rFonts w:ascii="Times New Roman" w:hAnsi="Times New Roman"/>
+          <w:b/>
+          <w:i w:val="0"/>
+          <w:sz w:val="20"/>
+        </w:rPr>
+        <w:t>V. STAKEHOLDER IMPLICATIONS</w:t>
+      </w:r>
+    </w:p>
+    <w:p>
+      <w:pPr>
+        <w:spacing w:before="0" w:after="80" w:line="240" w:lineRule="auto"/>
         <w:jc w:val="both"/>
       </w:pPr>
       <w:r>
         <w:rPr>
-          <w:rFonts w:ascii="Calibri" w:hAnsi="Calibri"/>
-          <w:b/>
-          <w:i w:val="0"/>
-          <w:color w:val="000000"/>
-          <w:sz w:val="22"/>
-        </w:rPr>
-        <w:t xml:space="preserve">Recommendation 2: </w:t>
-      </w:r>
-      <w:r>
-        <w:rPr>
-          <w:rFonts w:ascii="Calibri" w:hAnsi="Calibri"/>
+          <w:rFonts w:ascii="Times New Roman" w:hAnsi="Times New Roman"/>
           <w:b w:val="0"/>
           <w:i w:val="0"/>
-          <w:color w:val="000000"/>
-          <w:sz w:val="22"/>
+          <w:sz w:val="20"/>
         </w:rPr>
-        <w:t>Use customer-value tiers. Combine total profit, profit margin, and line-item volume to identify high-value accounts to protect and low-value accounts that require revised pricing, service, or account-management strategies.</w:t>
+        <w:t>For government and public-sector stakeholders, this dashboard demonstrates how commercial data can support transparent, margin-aware oversight. The operation covers more than 180,000 order lines and $36M in sales. Aggregated customer, category, product, market, and discount views can help frame questions about regional competitiveness, economic activity, and service strategy. These descriptive results should be combined with operational and qualitative evidence before decisions about any specific region or organization are made.</w:t>
       </w:r>
     </w:p>
     <w:p>
       <w:pPr>
-        <w:spacing w:after="160" w:line="319" w:lineRule="auto"/>
+        <w:keepNext/>
+        <w:spacing w:before="160" w:after="80"/>
+        <w:jc w:val="center"/>
+      </w:pPr>
+      <w:r>
+        <w:rPr>
+          <w:rFonts w:ascii="Times New Roman" w:hAnsi="Times New Roman"/>
+          <w:b/>
+          <w:i w:val="0"/>
+          <w:sz w:val="20"/>
+        </w:rPr>
+        <w:t>VI. LIMITATIONS AND FUTURE WORK</w:t>
+      </w:r>
+    </w:p>
+    <w:p>
+      <w:pPr>
+        <w:spacing w:before="0" w:after="80" w:line="240" w:lineRule="auto"/>
         <w:jc w:val="both"/>
       </w:pPr>
       <w:r>
         <w:rPr>
-          <w:rFonts w:ascii="Calibri" w:hAnsi="Calibri"/>
-          <w:b/>
-          <w:i w:val="0"/>
-          <w:color w:val="000000"/>
-          <w:sz w:val="22"/>
-        </w:rPr>
-        <w:t xml:space="preserve">Recommendation 3: </w:t>
-      </w:r>
-      <w:r>
-        <w:rPr>
-          <w:rFonts w:ascii="Calibri" w:hAnsi="Calibri"/>
+          <w:rFonts w:ascii="Times New Roman" w:hAnsi="Times New Roman"/>
           <w:b w:val="0"/>
           <w:i w:val="0"/>
-          <w:color w:val="000000"/>
-          <w:sz w:val="22"/>
+          <w:sz w:val="20"/>
         </w:rPr>
-        <w:t>Protect high-value categories and markets. Prioritize availability and promotional discipline for Fishing, Cleats, Camping &amp; Hiking, Europe, and LATAM. Pair this with category-level profit monitoring to prevent revenue growth that does not translate into margin.</w:t>
+        <w:t>The analysis is descriptive and uses a single supplied data set. The lack of order dates prevents seasonal, longitudinal, and forecasting analysis. Future work should add time stamps, fulfilment cost, customer satisfaction, return data, and campaign information. These additions would support forecasting, customer-lifetime analysis, promotion measurement, and more robust predictive or causal studies.</w:t>
       </w:r>
     </w:p>
     <w:p>
       <w:pPr>
-        <w:spacing w:after="160" w:line="319" w:lineRule="auto"/>
+        <w:keepNext/>
+        <w:spacing w:before="160" w:after="80"/>
+        <w:jc w:val="center"/>
+      </w:pPr>
+      <w:r>
+        <w:rPr>
+          <w:rFonts w:ascii="Times New Roman" w:hAnsi="Times New Roman"/>
+          <w:b/>
+          <w:i w:val="0"/>
+          <w:sz w:val="20"/>
+        </w:rPr>
+        <w:t>VII. CONCLUSION</w:t>
+      </w:r>
+    </w:p>
+    <w:p>
+      <w:pPr>
+        <w:spacing w:before="0" w:after="80" w:line="240" w:lineRule="auto"/>
         <w:jc w:val="both"/>
       </w:pPr>
       <w:r>
         <w:rPr>
-          <w:rFonts w:ascii="Calibri" w:hAnsi="Calibri"/>
-          <w:b/>
-          <w:i w:val="0"/>
-          <w:color w:val="000000"/>
-          <w:sz w:val="22"/>
-        </w:rPr>
-        <w:t xml:space="preserve">Recommendation 4: </w:t>
-      </w:r>
-      <w:r>
-        <w:rPr>
-          <w:rFonts w:ascii="Calibri" w:hAnsi="Calibri"/>
+          <w:rFonts w:ascii="Times New Roman" w:hAnsi="Times New Roman"/>
           <w:b w:val="0"/>
           <w:i w:val="0"/>
-          <w:color w:val="000000"/>
-          <w:sz w:val="22"/>
+          <w:sz w:val="20"/>
         </w:rPr>
-        <w:t>Institutionalize dashboard governance. Publish a weekly management view of revenue, profit, margin, discount, customer value, and category-market performance. Assign owners to investigate adverse movements and document decisions in an operational review cadence.</w:t>
+        <w:t>The APL Logistics dashboard converts 180,519 order-line records into a practical decision-support tool. The EDA identifies $36.78M in sales, $3.97M in profit, a 10.8% margin, value concentration in Europe and LATAM, customer-segment differences, and margin pressure associated with deeper discounts. The most immediate actions are to strengthen discount governance, use customer-value tiers, protect high-value categories, and embed profitability review in management routines.</w:t>
       </w:r>
     </w:p>
     <w:p>
       <w:pPr>
-        <w:spacing w:before="360" w:after="200"/>
+        <w:keepNext/>
+        <w:spacing w:before="160" w:after="80"/>
+        <w:jc w:val="center"/>
       </w:pPr>
       <w:r>
         <w:rPr>
-          <w:rFonts w:ascii="Calibri" w:hAnsi="Calibri"/>
+          <w:rFonts w:ascii="Times New Roman" w:hAnsi="Times New Roman"/>
           <w:b/>
           <w:i w:val="0"/>
-          <w:color w:val="2E74B5"/>
-          <w:sz w:val="32"/>
+          <w:sz w:val="20"/>
         </w:rPr>
-        <w:t>5. Executive Summary for Government Stakeholders</w:t>
+        <w:t>REFERENCES</w:t>
       </w:r>
     </w:p>
     <w:p>
       <w:pPr>
-        <w:spacing w:after="160" w:line="319" w:lineRule="auto"/>
-        <w:jc w:val="both"/>
+        <w:spacing w:before="0" w:after="40" w:line="240" w:lineRule="auto"/>
+        <w:ind w:left="216" w:hanging="216"/>
+        <w:jc w:val="left"/>
       </w:pPr>
       <w:r>
         <w:rPr>
-          <w:rFonts w:ascii="Calibri" w:hAnsi="Calibri"/>
+          <w:rFonts w:ascii="Times New Roman" w:hAnsi="Times New Roman"/>
           <w:b w:val="0"/>
           <w:i w:val="0"/>
-          <w:color w:val="000000"/>
-          <w:sz w:val="22"/>
+          <w:sz w:val="16"/>
         </w:rPr>
-        <w:t>Reliable logistics networks support trade, employment, consumer access, and regional competitiveness. This project demonstrates how commercial data can be converted into transparent performance indicators for policy and management conversations. The dataset shows a commercially significant logistics operation with more than 180,000 order lines and sales exceeding $36 million. Its profitability, customer, product, and market views demonstrate how decision makers can move from revenue-focused reporting to margin-aware oversight.</w:t>
+        <w:t>[1] APL Logistics, "APL_Logistics.csv," data set supplied for the Supply Chain Analytics Project, 2026.</w:t>
       </w:r>
     </w:p>
     <w:p>
       <w:pPr>
-        <w:spacing w:after="160" w:line="319" w:lineRule="auto"/>
-        <w:jc w:val="both"/>
+        <w:spacing w:before="0" w:after="40" w:line="240" w:lineRule="auto"/>
+        <w:ind w:left="216" w:hanging="216"/>
+        <w:jc w:val="left"/>
       </w:pPr>
       <w:r>
         <w:rPr>
-          <w:rFonts w:ascii="Calibri" w:hAnsi="Calibri"/>
+          <w:rFonts w:ascii="Times New Roman" w:hAnsi="Times New Roman"/>
           <w:b w:val="0"/>
           <w:i w:val="0"/>
-          <w:color w:val="000000"/>
-          <w:sz w:val="22"/>
+          <w:sz w:val="16"/>
         </w:rPr>
-        <w:t>For public-sector stakeholders, the dashboard is relevant as a model for evidence-based oversight. Aggregated views can reveal where infrastructure constraints, service-level gaps, or market disparities warrant additional investigation. The analysis should be used alongside qualitative carrier, warehouse, and customer evidence; it does not identify individual causes of delay or justify conclusions about any region without further validation.</w:t>
+        <w:t>[2] W. McKinney, "pandas: powerful Python data analysis toolkit." [Online]. Available: https://pandas.pydata.org/</w:t>
       </w:r>
     </w:p>
     <w:p>
       <w:pPr>
-        <w:spacing w:before="360" w:after="200"/>
+        <w:spacing w:before="0" w:after="40" w:line="240" w:lineRule="auto"/>
+        <w:ind w:left="216" w:hanging="216"/>
+        <w:jc w:val="left"/>
       </w:pPr>
       <w:r>
         <w:rPr>
-          <w:rFonts w:ascii="Calibri" w:hAnsi="Calibri"/>
-          <w:b/>
+          <w:rFonts w:ascii="Times New Roman" w:hAnsi="Times New Roman"/>
+          <w:b w:val="0"/>
           <w:i w:val="0"/>
-          <w:color w:val="2E74B5"/>
-          <w:sz w:val="32"/>
+          <w:sz w:val="16"/>
         </w:rPr>
-        <w:t>6. Limitations and Future Work</w:t>
+        <w:t>[3] Streamlit, "Streamlit documentation." [Online]. Available: https://docs.streamlit.io/</w:t>
       </w:r>
     </w:p>
     <w:p>
       <w:pPr>
-        <w:spacing w:after="160" w:line="319" w:lineRule="auto"/>
-        <w:jc w:val="both"/>
+        <w:spacing w:before="0" w:after="40" w:line="240" w:lineRule="auto"/>
+        <w:ind w:left="216" w:hanging="216"/>
+        <w:jc w:val="left"/>
       </w:pPr>
       <w:r>
         <w:rPr>
-          <w:rFonts w:ascii="Calibri" w:hAnsi="Calibri"/>
+          <w:rFonts w:ascii="Times New Roman" w:hAnsi="Times New Roman"/>
           <w:b w:val="0"/>
           <w:i w:val="0"/>
-          <w:color w:val="000000"/>
-          <w:sz w:val="22"/>
+          <w:sz w:val="16"/>
         </w:rPr>
-        <w:t>The study is descriptive and based on a single supplied dataset. The absence of order dates prevents seasonal, longitudinal, and forecasting analysis. Future work should add time stamps, fulfilment cost, customer satisfaction, returns, and campaign information. Those fields would support forecasting, customer-lifetime analysis, promotion measurement, and more robust causal or predictive modelling.</w:t>
-      </w:r>
-    </w:p>
-    <w:p>
-      <w:pPr>
-        <w:spacing w:before="360" w:after="200"/>
-      </w:pPr>
-      <w:r>
-        <w:rPr>
-          <w:rFonts w:ascii="Calibri" w:hAnsi="Calibri"/>
-          <w:b/>
-          <w:i w:val="0"/>
-          <w:color w:val="2E74B5"/>
-          <w:sz w:val="32"/>
-        </w:rPr>
-        <w:t>7. Conclusion</w:t>
-      </w:r>
-    </w:p>
-    <w:p>
-      <w:pPr>
-        <w:spacing w:after="160" w:line="319" w:lineRule="auto"/>
-        <w:jc w:val="both"/>
-      </w:pPr>
-      <w:r>
-        <w:rPr>
-          <w:rFonts w:ascii="Calibri" w:hAnsi="Calibri"/>
-          <w:b w:val="0"/>
-          <w:i w:val="0"/>
-          <w:color w:val="000000"/>
-          <w:sz w:val="22"/>
-        </w:rPr>
-        <w:t>The APL Logistics dashboard converts 180,519 order-line records into a practical decision-support tool. EDA shows $36.78M in sales, $3.97M in profit, a 10.8% overall margin, strong value concentration in Europe and LATAM, and meaningful variation across customer segments. The most immediate actions are to strengthen discount governance, use customer-value tiers, protect high-value categories, and embed the dashboard in a recurring performance-review process.</w:t>
-      </w:r>
-    </w:p>
-    <w:p>
-      <w:pPr>
-        <w:spacing w:before="360" w:after="200"/>
-      </w:pPr>
-      <w:r>
-        <w:rPr>
-          <w:rFonts w:ascii="Calibri" w:hAnsi="Calibri"/>
-          <w:b/>
-          <w:i w:val="0"/>
-          <w:color w:val="2E74B5"/>
-          <w:sz w:val="32"/>
-        </w:rPr>
-        <w:t>References</w:t>
-      </w:r>
-    </w:p>
-    <w:p>
-      <w:pPr>
-        <w:spacing w:after="100"/>
-        <w:ind w:left="360" w:hanging="360"/>
-      </w:pPr>
-      <w:r>
-        <w:rPr>
-          <w:rFonts w:ascii="Calibri" w:hAnsi="Calibri"/>
-          <w:b w:val="0"/>
-          <w:i w:val="0"/>
-          <w:color w:val="000000"/>
-          <w:sz w:val="20"/>
-        </w:rPr>
-        <w:t>APL Logistics. (2026). APL_Logistics.csv [Data set provided for the Supply Chain Analytics Project].</w:t>
-      </w:r>
-    </w:p>
-    <w:p>
-      <w:pPr>
-        <w:spacing w:after="100"/>
-        <w:ind w:left="360" w:hanging="360"/>
-      </w:pPr>
-      <w:r>
-        <w:rPr>
-          <w:rFonts w:ascii="Calibri" w:hAnsi="Calibri"/>
-          <w:b w:val="0"/>
-          <w:i w:val="0"/>
-          <w:color w:val="000000"/>
-          <w:sz w:val="20"/>
-        </w:rPr>
-        <w:t>McKinney, W. (2024). pandas: powerful Python data analysis toolkit. https://pandas.pydata.org/</w:t>
-      </w:r>
-    </w:p>
-    <w:p>
-      <w:pPr>
-        <w:spacing w:after="100"/>
-        <w:ind w:left="360" w:hanging="360"/>
-      </w:pPr>
-      <w:r>
-        <w:rPr>
-          <w:rFonts w:ascii="Calibri" w:hAnsi="Calibri"/>
-          <w:b w:val="0"/>
-          <w:i w:val="0"/>
-          <w:color w:val="000000"/>
-          <w:sz w:val="20"/>
-        </w:rPr>
-        <w:t>Streamlit. (2026). Streamlit documentation. https://docs.streamlit.io/</w:t>
-      </w:r>
-    </w:p>
-    <w:p>
-      <w:pPr>
-        <w:spacing w:after="100"/>
-        <w:ind w:left="360" w:hanging="360"/>
-      </w:pPr>
-      <w:r>
-        <w:rPr>
-          <w:rFonts w:ascii="Calibri" w:hAnsi="Calibri"/>
-          <w:b w:val="0"/>
-          <w:i w:val="0"/>
-          <w:color w:val="000000"/>
-          <w:sz w:val="20"/>
-        </w:rPr>
-        <w:t>Plotly. (2026). Plotly Python graphing library documentation. https://plotly.com/python/</w:t>
+        <w:t>[4] Plotly, "Plotly Python graphing library documentation." [Online]. Available: https://plotly.com/python/</w:t>
       </w:r>
     </w:p>
     <w:sectPr>
-      <w:headerReference w:type="default" r:id="rId9"/>
-      <w:footerReference w:type="default" r:id="rId10"/>
+      <w:type w:val="continuous"/>
       <w:pgSz w:w="12240" w:h="15840"/>
-      <w:pgMar w:top="1440" w:right="1440" w:bottom="1440" w:left="1440" w:header="708" w:footer="708" w:gutter="0"/>
-      <w:cols w:space="720"/>
+      <w:pgMar w:top="936" w:right="1080" w:bottom="936" w:left="1080" w:header="720" w:footer="720" w:gutter="0"/>
+      <w:cols w:space="360" w:num="2"/>
       <w:docGrid w:linePitch="360"/>
     </w:sectPr>
   </w:body>
 </w:document>
-</file>
-
-<file path=word/footer1.xml><?xml version="1.0" encoding="utf-8"?>
-<w:ftr xmlns:m="http://schemas.openxmlformats.org/officeDocument/2006/math" xmlns:mc="http://schemas.openxmlformats.org/markup-compatibility/2006" xmlns:mo="http://schemas.microsoft.com/office/mac/office/2008/main" xmlns:mv="urn:schemas-microsoft-com:mac:vml" xmlns:o="urn:schemas-microsoft-com:office:office" xmlns:r="http://schemas.openxmlformats.org/officeDocument/2006/relationships" xmlns:v="urn:schemas-microsoft-com:vml" xmlns:w10="urn:schemas-microsoft-com:office:word" xmlns:w14="http://schemas.microsoft.com/office/word/2010/wordml" xmlns:w="http://schemas.openxmlformats.org/wordprocessingml/2006/main" xmlns:wne="http://schemas.microsoft.com/office/word/2006/wordml" xmlns:wp14="http://schemas.microsoft.com/office/word/2010/wordprocessingDrawing" xmlns:wp="http://schemas.openxmlformats.org/drawingml/2006/wordprocessingDrawing" xmlns:wpc="http://schemas.microsoft.com/office/word/2010/wordprocessingCanvas" xmlns:wpg="http://schemas.microsoft.com/office/word/2010/wordprocessingGroup" xmlns:wpi="http://schemas.microsoft.com/office/word/2010/wordprocessingInk" xmlns:wps="http://schemas.microsoft.com/office/word/2010/wordprocessingShape" mc:Ignorable="w14 wp14">
-  <w:p>
-    <w:pPr>
-      <w:pStyle w:val="Footer"/>
-      <w:jc w:val="center"/>
-    </w:pPr>
-    <w:r>
-      <w:rPr>
-        <w:rFonts w:ascii="Calibri" w:hAnsi="Calibri"/>
-        <w:b w:val="0"/>
-        <w:i w:val="0"/>
-        <w:color w:val="595959"/>
-        <w:sz w:val="16"/>
-      </w:rPr>
-      <w:t>Supply Chain Analytics Project</w:t>
-    </w:r>
-  </w:p>
-</w:ftr>
-</file>
-
-<file path=word/header1.xml><?xml version="1.0" encoding="utf-8"?>
-<w:hdr xmlns:m="http://schemas.openxmlformats.org/officeDocument/2006/math" xmlns:mc="http://schemas.openxmlformats.org/markup-compatibility/2006" xmlns:mo="http://schemas.microsoft.com/office/mac/office/2008/main" xmlns:mv="urn:schemas-microsoft-com:mac:vml" xmlns:o="urn:schemas-microsoft-com:office:office" xmlns:r="http://schemas.openxmlformats.org/officeDocument/2006/relationships" xmlns:v="urn:schemas-microsoft-com:vml" xmlns:w10="urn:schemas-microsoft-com:office:word" xmlns:w14="http://schemas.microsoft.com/office/word/2010/wordml" xmlns:w="http://schemas.openxmlformats.org/wordprocessingml/2006/main" xmlns:wne="http://schemas.microsoft.com/office/word/2006/wordml" xmlns:wp14="http://schemas.microsoft.com/office/word/2010/wordprocessingDrawing" xmlns:wp="http://schemas.openxmlformats.org/drawingml/2006/wordprocessingDrawing" xmlns:wpc="http://schemas.microsoft.com/office/word/2010/wordprocessingCanvas" xmlns:wpg="http://schemas.microsoft.com/office/word/2010/wordprocessingGroup" xmlns:wpi="http://schemas.microsoft.com/office/word/2010/wordprocessingInk" xmlns:wps="http://schemas.microsoft.com/office/word/2010/wordprocessingShape" mc:Ignorable="w14 wp14">
-  <w:p>
-    <w:pPr>
-      <w:pStyle w:val="Header"/>
-      <w:jc w:val="right"/>
-    </w:pPr>
-    <w:r>
-      <w:rPr>
-        <w:rFonts w:ascii="Calibri" w:hAnsi="Calibri"/>
-        <w:b w:val="0"/>
-        <w:i w:val="0"/>
-        <w:color w:val="595959"/>
-        <w:sz w:val="16"/>
-      </w:rPr>
-      <w:t>APL Logistics Profitability Intelligence | Research Paper</w:t>
-    </w:r>
-  </w:p>
-</w:hdr>
 </file>
 
 <file path=word/numbering.xml><?xml version="1.0" encoding="utf-8"?>
@@ -2175,11 +1870,11 @@
     <w:qFormat/>
     <w:rsid w:val="00FC693F"/>
     <w:pPr>
-      <w:spacing w:after="160" w:line="319" w:lineRule="auto"/>
+      <w:spacing w:line="240" w:lineRule="auto" w:after="80"/>
     </w:pPr>
     <w:rPr>
-      <w:rFonts w:ascii="Calibri" w:hAnsi="Calibri"/>
-      <w:sz w:val="22"/>
+      <w:rFonts w:ascii="Times New Roman" w:hAnsi="Times New Roman"/>
+      <w:sz w:val="20"/>
     </w:rPr>
   </w:style>
   <w:style w:type="paragraph" w:styleId="Header">

</xml_diff>